<commit_message>
Upload laporan final UTS PBO
</commit_message>
<xml_diff>
--- a/LAPORAN UTS PBO_04231026.docx
+++ b/LAPORAN UTS PBO_04231026.docx
@@ -476,1495 +476,7 @@
           <w:sz w:val="28"/>
           <w:szCs w:val="28"/>
         </w:rPr>
-        <w:t>2026</w:t>
-      </w:r>
-    </w:p>
-    <w:p>
-      <w:pPr>
-        <w:pStyle w:val="Heading1"/>
-        <w:rPr>
-          <w:rFonts w:eastAsia="Times New Roman"/>
-        </w:rPr>
-      </w:pPr>
-      <w:bookmarkStart w:id="0" w:name="_Toc227856146"/>
-      <w:r>
-        <w:rPr>
-          <w:rFonts w:eastAsia="Times New Roman"/>
-        </w:rPr>
-        <w:t>DAFTAR ISI</w:t>
-      </w:r>
-      <w:bookmarkEnd w:id="0"/>
-    </w:p>
-    <w:p/>
-    <w:p>
-      <w:pPr>
-        <w:pStyle w:val="Heading1"/>
-      </w:pPr>
-      <w:r>
-        <w:lastRenderedPageBreak/>
-        <w:t>DAFTAR ISI</w:t>
-      </w:r>
-    </w:p>
-    <w:sdt>
-      <w:sdtPr>
-        <w:id w:val="1725179575"/>
-        <w:docPartObj>
-          <w:docPartGallery w:val="Table of Contents"/>
-          <w:docPartUnique/>
-        </w:docPartObj>
-      </w:sdtPr>
-      <w:sdtEndPr>
-        <w:rPr>
-          <w:rFonts w:ascii="Times New Roman" w:eastAsiaTheme="minorHAnsi" w:hAnsi="Times New Roman" w:cstheme="minorBidi"/>
-          <w:b/>
-          <w:bCs/>
-          <w:noProof/>
-          <w:color w:val="auto"/>
-          <w:kern w:val="2"/>
-          <w:sz w:val="24"/>
-          <w:szCs w:val="24"/>
-          <w14:ligatures w14:val="standardContextual"/>
-        </w:rPr>
-      </w:sdtEndPr>
-      <w:sdtContent>
-        <w:p>
-          <w:pPr>
-            <w:pStyle w:val="TOCHeading"/>
-            <w:spacing w:line="360" w:lineRule="auto"/>
-          </w:pPr>
-        </w:p>
-        <w:p>
-          <w:pPr>
-            <w:pStyle w:val="TOC1"/>
-            <w:tabs>
-              <w:tab w:val="right" w:leader="dot" w:pos="9350"/>
-            </w:tabs>
-            <w:rPr>
-              <w:rFonts w:asciiTheme="minorHAnsi" w:eastAsiaTheme="minorEastAsia" w:hAnsiTheme="minorHAnsi"/>
-              <w:noProof/>
-              <w:lang w:val="en-ID" w:eastAsia="en-ID"/>
-            </w:rPr>
-          </w:pPr>
-          <w:r>
-            <w:fldChar w:fldCharType="begin"/>
-          </w:r>
-          <w:r>
-            <w:instrText xml:space="preserve"> TOC \o "1-3" \h \z \u </w:instrText>
-          </w:r>
-          <w:r>
-            <w:fldChar w:fldCharType="separate"/>
-          </w:r>
-          <w:hyperlink w:anchor="_Toc227856146" w:history="1">
-            <w:r>
-              <w:rPr>
-                <w:rStyle w:val="Hyperlink"/>
-                <w:rFonts w:eastAsia="Times New Roman"/>
-                <w:noProof/>
-              </w:rPr>
-              <w:t>DAFTAR ISI</w:t>
-            </w:r>
-            <w:r>
-              <w:rPr>
-                <w:noProof/>
-                <w:webHidden/>
-              </w:rPr>
-              <w:tab/>
-            </w:r>
-            <w:r>
-              <w:rPr>
-                <w:noProof/>
-                <w:webHidden/>
-              </w:rPr>
-              <w:fldChar w:fldCharType="begin"/>
-            </w:r>
-            <w:r>
-              <w:rPr>
-                <w:noProof/>
-                <w:webHidden/>
-              </w:rPr>
-              <w:instrText xml:space="preserve"> PAGEREF _Toc227856146 \h </w:instrText>
-            </w:r>
-            <w:r>
-              <w:rPr>
-                <w:noProof/>
-                <w:webHidden/>
-              </w:rPr>
-            </w:r>
-            <w:r>
-              <w:rPr>
-                <w:noProof/>
-                <w:webHidden/>
-              </w:rPr>
-              <w:fldChar w:fldCharType="separate"/>
-            </w:r>
-            <w:r>
-              <w:rPr>
-                <w:noProof/>
-                <w:webHidden/>
-              </w:rPr>
-              <w:t>i</w:t>
-            </w:r>
-            <w:r>
-              <w:rPr>
-                <w:noProof/>
-                <w:webHidden/>
-              </w:rPr>
-              <w:fldChar w:fldCharType="end"/>
-            </w:r>
-          </w:hyperlink>
-        </w:p>
-        <w:p>
-          <w:pPr>
-            <w:pStyle w:val="TOC1"/>
-            <w:tabs>
-              <w:tab w:val="right" w:leader="dot" w:pos="9350"/>
-            </w:tabs>
-            <w:rPr>
-              <w:rFonts w:asciiTheme="minorHAnsi" w:eastAsiaTheme="minorEastAsia" w:hAnsiTheme="minorHAnsi"/>
-              <w:noProof/>
-              <w:lang w:val="en-ID" w:eastAsia="en-ID"/>
-            </w:rPr>
-          </w:pPr>
-          <w:hyperlink w:anchor="_Toc227856147" w:history="1">
-            <w:r>
-              <w:rPr>
-                <w:rStyle w:val="Hyperlink"/>
-                <w:rFonts w:cs="Times New Roman"/>
-                <w:bCs/>
-                <w:noProof/>
-                <w:lang w:val="id-ID"/>
-              </w:rPr>
-              <w:t>BAB 1  PENDAHULUAN</w:t>
-            </w:r>
-            <w:r>
-              <w:rPr>
-                <w:noProof/>
-                <w:webHidden/>
-              </w:rPr>
-              <w:tab/>
-            </w:r>
-            <w:r>
-              <w:rPr>
-                <w:noProof/>
-                <w:webHidden/>
-              </w:rPr>
-              <w:fldChar w:fldCharType="begin"/>
-            </w:r>
-            <w:r>
-              <w:rPr>
-                <w:noProof/>
-                <w:webHidden/>
-              </w:rPr>
-              <w:instrText xml:space="preserve"> PAGEREF _Toc227856147 \h </w:instrText>
-            </w:r>
-            <w:r>
-              <w:rPr>
-                <w:noProof/>
-                <w:webHidden/>
-              </w:rPr>
-            </w:r>
-            <w:r>
-              <w:rPr>
-                <w:noProof/>
-                <w:webHidden/>
-              </w:rPr>
-              <w:fldChar w:fldCharType="separate"/>
-            </w:r>
-            <w:r>
-              <w:rPr>
-                <w:noProof/>
-                <w:webHidden/>
-              </w:rPr>
-              <w:t>1</w:t>
-            </w:r>
-            <w:r>
-              <w:rPr>
-                <w:noProof/>
-                <w:webHidden/>
-              </w:rPr>
-              <w:fldChar w:fldCharType="end"/>
-            </w:r>
-          </w:hyperlink>
-        </w:p>
-        <w:p>
-          <w:pPr>
-            <w:pStyle w:val="TOC2"/>
-            <w:tabs>
-              <w:tab w:val="left" w:pos="960"/>
-              <w:tab w:val="right" w:leader="dot" w:pos="9350"/>
-            </w:tabs>
-            <w:rPr>
-              <w:rFonts w:asciiTheme="minorHAnsi" w:eastAsiaTheme="minorEastAsia" w:hAnsiTheme="minorHAnsi"/>
-              <w:noProof/>
-              <w:lang w:val="en-ID" w:eastAsia="en-ID"/>
-            </w:rPr>
-          </w:pPr>
-          <w:hyperlink w:anchor="_Toc227856148" w:history="1">
-            <w:r>
-              <w:rPr>
-                <w:rStyle w:val="Hyperlink"/>
-                <w:rFonts w:cs="Times New Roman"/>
-                <w:bCs/>
-                <w:noProof/>
-                <w:lang w:val="id-ID"/>
-              </w:rPr>
-              <w:t>1.1</w:t>
-            </w:r>
-            <w:r>
-              <w:rPr>
-                <w:rFonts w:asciiTheme="minorHAnsi" w:eastAsiaTheme="minorEastAsia" w:hAnsiTheme="minorHAnsi"/>
-                <w:noProof/>
-                <w:lang w:val="en-ID" w:eastAsia="en-ID"/>
-              </w:rPr>
-              <w:tab/>
-            </w:r>
-            <w:r>
-              <w:rPr>
-                <w:rStyle w:val="Hyperlink"/>
-                <w:rFonts w:cs="Times New Roman"/>
-                <w:bCs/>
-                <w:noProof/>
-                <w:lang w:val="id-ID"/>
-              </w:rPr>
-              <w:t>Latar Belakang</w:t>
-            </w:r>
-            <w:r>
-              <w:rPr>
-                <w:noProof/>
-                <w:webHidden/>
-              </w:rPr>
-              <w:tab/>
-            </w:r>
-            <w:r>
-              <w:rPr>
-                <w:noProof/>
-                <w:webHidden/>
-              </w:rPr>
-              <w:fldChar w:fldCharType="begin"/>
-            </w:r>
-            <w:r>
-              <w:rPr>
-                <w:noProof/>
-                <w:webHidden/>
-              </w:rPr>
-              <w:instrText xml:space="preserve"> PAGEREF _Toc227856148 \h </w:instrText>
-            </w:r>
-            <w:r>
-              <w:rPr>
-                <w:noProof/>
-                <w:webHidden/>
-              </w:rPr>
-            </w:r>
-            <w:r>
-              <w:rPr>
-                <w:noProof/>
-                <w:webHidden/>
-              </w:rPr>
-              <w:fldChar w:fldCharType="separate"/>
-            </w:r>
-            <w:r>
-              <w:rPr>
-                <w:noProof/>
-                <w:webHidden/>
-              </w:rPr>
-              <w:t>1</w:t>
-            </w:r>
-            <w:r>
-              <w:rPr>
-                <w:noProof/>
-                <w:webHidden/>
-              </w:rPr>
-              <w:fldChar w:fldCharType="end"/>
-            </w:r>
-          </w:hyperlink>
-        </w:p>
-        <w:p>
-          <w:pPr>
-            <w:pStyle w:val="TOC2"/>
-            <w:tabs>
-              <w:tab w:val="left" w:pos="960"/>
-              <w:tab w:val="right" w:leader="dot" w:pos="9350"/>
-            </w:tabs>
-            <w:rPr>
-              <w:rFonts w:asciiTheme="minorHAnsi" w:eastAsiaTheme="minorEastAsia" w:hAnsiTheme="minorHAnsi"/>
-              <w:noProof/>
-              <w:lang w:val="en-ID" w:eastAsia="en-ID"/>
-            </w:rPr>
-          </w:pPr>
-          <w:hyperlink w:anchor="_Toc227856149" w:history="1">
-            <w:r>
-              <w:rPr>
-                <w:rStyle w:val="Hyperlink"/>
-                <w:rFonts w:cs="Times New Roman"/>
-                <w:bCs/>
-                <w:noProof/>
-                <w:lang w:val="id-ID"/>
-              </w:rPr>
-              <w:t>1.2</w:t>
-            </w:r>
-            <w:r>
-              <w:rPr>
-                <w:rFonts w:asciiTheme="minorHAnsi" w:eastAsiaTheme="minorEastAsia" w:hAnsiTheme="minorHAnsi"/>
-                <w:noProof/>
-                <w:lang w:val="en-ID" w:eastAsia="en-ID"/>
-              </w:rPr>
-              <w:tab/>
-            </w:r>
-            <w:r>
-              <w:rPr>
-                <w:rStyle w:val="Hyperlink"/>
-                <w:rFonts w:cs="Times New Roman"/>
-                <w:bCs/>
-                <w:noProof/>
-                <w:lang w:val="id-ID"/>
-              </w:rPr>
-              <w:t>Rumusan Masalah</w:t>
-            </w:r>
-            <w:r>
-              <w:rPr>
-                <w:noProof/>
-                <w:webHidden/>
-              </w:rPr>
-              <w:tab/>
-            </w:r>
-            <w:r>
-              <w:rPr>
-                <w:noProof/>
-                <w:webHidden/>
-              </w:rPr>
-              <w:fldChar w:fldCharType="begin"/>
-            </w:r>
-            <w:r>
-              <w:rPr>
-                <w:noProof/>
-                <w:webHidden/>
-              </w:rPr>
-              <w:instrText xml:space="preserve"> PAGEREF _Toc227856149 \h </w:instrText>
-            </w:r>
-            <w:r>
-              <w:rPr>
-                <w:noProof/>
-                <w:webHidden/>
-              </w:rPr>
-            </w:r>
-            <w:r>
-              <w:rPr>
-                <w:noProof/>
-                <w:webHidden/>
-              </w:rPr>
-              <w:fldChar w:fldCharType="separate"/>
-            </w:r>
-            <w:r>
-              <w:rPr>
-                <w:noProof/>
-                <w:webHidden/>
-              </w:rPr>
-              <w:t>2</w:t>
-            </w:r>
-            <w:r>
-              <w:rPr>
-                <w:noProof/>
-                <w:webHidden/>
-              </w:rPr>
-              <w:fldChar w:fldCharType="end"/>
-            </w:r>
-          </w:hyperlink>
-        </w:p>
-        <w:p>
-          <w:pPr>
-            <w:pStyle w:val="TOC2"/>
-            <w:tabs>
-              <w:tab w:val="left" w:pos="960"/>
-              <w:tab w:val="right" w:leader="dot" w:pos="9350"/>
-            </w:tabs>
-            <w:rPr>
-              <w:rFonts w:asciiTheme="minorHAnsi" w:eastAsiaTheme="minorEastAsia" w:hAnsiTheme="minorHAnsi"/>
-              <w:noProof/>
-              <w:lang w:val="en-ID" w:eastAsia="en-ID"/>
-            </w:rPr>
-          </w:pPr>
-          <w:hyperlink w:anchor="_Toc227856150" w:history="1">
-            <w:r>
-              <w:rPr>
-                <w:rStyle w:val="Hyperlink"/>
-                <w:rFonts w:cs="Times New Roman"/>
-                <w:bCs/>
-                <w:noProof/>
-                <w:lang w:val="id-ID"/>
-              </w:rPr>
-              <w:t>1.3</w:t>
-            </w:r>
-            <w:r>
-              <w:rPr>
-                <w:rFonts w:asciiTheme="minorHAnsi" w:eastAsiaTheme="minorEastAsia" w:hAnsiTheme="minorHAnsi"/>
-                <w:noProof/>
-                <w:lang w:val="en-ID" w:eastAsia="en-ID"/>
-              </w:rPr>
-              <w:tab/>
-            </w:r>
-            <w:r>
-              <w:rPr>
-                <w:rStyle w:val="Hyperlink"/>
-                <w:rFonts w:cs="Times New Roman"/>
-                <w:bCs/>
-                <w:noProof/>
-                <w:lang w:val="id-ID"/>
-              </w:rPr>
-              <w:t>Tujuan</w:t>
-            </w:r>
-            <w:r>
-              <w:rPr>
-                <w:noProof/>
-                <w:webHidden/>
-              </w:rPr>
-              <w:tab/>
-            </w:r>
-            <w:r>
-              <w:rPr>
-                <w:noProof/>
-                <w:webHidden/>
-              </w:rPr>
-              <w:fldChar w:fldCharType="begin"/>
-            </w:r>
-            <w:r>
-              <w:rPr>
-                <w:noProof/>
-                <w:webHidden/>
-              </w:rPr>
-              <w:instrText xml:space="preserve"> PAGEREF _Toc227856150 \h </w:instrText>
-            </w:r>
-            <w:r>
-              <w:rPr>
-                <w:noProof/>
-                <w:webHidden/>
-              </w:rPr>
-            </w:r>
-            <w:r>
-              <w:rPr>
-                <w:noProof/>
-                <w:webHidden/>
-              </w:rPr>
-              <w:fldChar w:fldCharType="separate"/>
-            </w:r>
-            <w:r>
-              <w:rPr>
-                <w:noProof/>
-                <w:webHidden/>
-              </w:rPr>
-              <w:t>2</w:t>
-            </w:r>
-            <w:r>
-              <w:rPr>
-                <w:noProof/>
-                <w:webHidden/>
-              </w:rPr>
-              <w:fldChar w:fldCharType="end"/>
-            </w:r>
-          </w:hyperlink>
-        </w:p>
-        <w:p>
-          <w:pPr>
-            <w:pStyle w:val="TOC1"/>
-            <w:tabs>
-              <w:tab w:val="right" w:leader="dot" w:pos="9350"/>
-            </w:tabs>
-            <w:rPr>
-              <w:rFonts w:asciiTheme="minorHAnsi" w:eastAsiaTheme="minorEastAsia" w:hAnsiTheme="minorHAnsi"/>
-              <w:noProof/>
-              <w:lang w:val="en-ID" w:eastAsia="en-ID"/>
-            </w:rPr>
-          </w:pPr>
-          <w:hyperlink w:anchor="_Toc227856151" w:history="1">
-            <w:r>
-              <w:rPr>
-                <w:rStyle w:val="Hyperlink"/>
-                <w:noProof/>
-                <w:lang w:val="id-ID"/>
-              </w:rPr>
-              <w:t>BAB 2  ANALISIS SISTEM</w:t>
-            </w:r>
-            <w:r>
-              <w:rPr>
-                <w:noProof/>
-                <w:webHidden/>
-              </w:rPr>
-              <w:tab/>
-            </w:r>
-            <w:r>
-              <w:rPr>
-                <w:noProof/>
-                <w:webHidden/>
-              </w:rPr>
-              <w:fldChar w:fldCharType="begin"/>
-            </w:r>
-            <w:r>
-              <w:rPr>
-                <w:noProof/>
-                <w:webHidden/>
-              </w:rPr>
-              <w:instrText xml:space="preserve"> PAGEREF _Toc227856151 \h </w:instrText>
-            </w:r>
-            <w:r>
-              <w:rPr>
-                <w:noProof/>
-                <w:webHidden/>
-              </w:rPr>
-            </w:r>
-            <w:r>
-              <w:rPr>
-                <w:noProof/>
-                <w:webHidden/>
-              </w:rPr>
-              <w:fldChar w:fldCharType="separate"/>
-            </w:r>
-            <w:r>
-              <w:rPr>
-                <w:noProof/>
-                <w:webHidden/>
-              </w:rPr>
-              <w:t>3</w:t>
-            </w:r>
-            <w:r>
-              <w:rPr>
-                <w:noProof/>
-                <w:webHidden/>
-              </w:rPr>
-              <w:fldChar w:fldCharType="end"/>
-            </w:r>
-          </w:hyperlink>
-        </w:p>
-        <w:p>
-          <w:pPr>
-            <w:pStyle w:val="TOC2"/>
-            <w:tabs>
-              <w:tab w:val="left" w:pos="960"/>
-              <w:tab w:val="right" w:leader="dot" w:pos="9350"/>
-            </w:tabs>
-            <w:rPr>
-              <w:rFonts w:asciiTheme="minorHAnsi" w:eastAsiaTheme="minorEastAsia" w:hAnsiTheme="minorHAnsi"/>
-              <w:noProof/>
-              <w:lang w:val="en-ID" w:eastAsia="en-ID"/>
-            </w:rPr>
-          </w:pPr>
-          <w:hyperlink w:anchor="_Toc227856152" w:history="1">
-            <w:r>
-              <w:rPr>
-                <w:rStyle w:val="Hyperlink"/>
-                <w:rFonts w:cs="Times New Roman"/>
-                <w:bCs/>
-                <w:noProof/>
-                <w:lang w:val="id-ID"/>
-              </w:rPr>
-              <w:t xml:space="preserve">2.1 </w:t>
-            </w:r>
-            <w:r>
-              <w:rPr>
-                <w:rFonts w:asciiTheme="minorHAnsi" w:eastAsiaTheme="minorEastAsia" w:hAnsiTheme="minorHAnsi"/>
-                <w:noProof/>
-                <w:lang w:val="en-ID" w:eastAsia="en-ID"/>
-              </w:rPr>
-              <w:tab/>
-            </w:r>
-            <w:r>
-              <w:rPr>
-                <w:rStyle w:val="Hyperlink"/>
-                <w:rFonts w:cs="Times New Roman"/>
-                <w:bCs/>
-                <w:noProof/>
-                <w:lang w:val="id-ID"/>
-              </w:rPr>
-              <w:t>Analisis OOP</w:t>
-            </w:r>
-            <w:r>
-              <w:rPr>
-                <w:noProof/>
-                <w:webHidden/>
-              </w:rPr>
-              <w:tab/>
-            </w:r>
-            <w:r>
-              <w:rPr>
-                <w:noProof/>
-                <w:webHidden/>
-              </w:rPr>
-              <w:fldChar w:fldCharType="begin"/>
-            </w:r>
-            <w:r>
-              <w:rPr>
-                <w:noProof/>
-                <w:webHidden/>
-              </w:rPr>
-              <w:instrText xml:space="preserve"> PAGEREF _Toc227856152 \h </w:instrText>
-            </w:r>
-            <w:r>
-              <w:rPr>
-                <w:noProof/>
-                <w:webHidden/>
-              </w:rPr>
-            </w:r>
-            <w:r>
-              <w:rPr>
-                <w:noProof/>
-                <w:webHidden/>
-              </w:rPr>
-              <w:fldChar w:fldCharType="separate"/>
-            </w:r>
-            <w:r>
-              <w:rPr>
-                <w:noProof/>
-                <w:webHidden/>
-              </w:rPr>
-              <w:t>3</w:t>
-            </w:r>
-            <w:r>
-              <w:rPr>
-                <w:noProof/>
-                <w:webHidden/>
-              </w:rPr>
-              <w:fldChar w:fldCharType="end"/>
-            </w:r>
-          </w:hyperlink>
-        </w:p>
-        <w:p>
-          <w:pPr>
-            <w:pStyle w:val="TOC2"/>
-            <w:tabs>
-              <w:tab w:val="left" w:pos="960"/>
-              <w:tab w:val="right" w:leader="dot" w:pos="9350"/>
-            </w:tabs>
-            <w:rPr>
-              <w:rFonts w:asciiTheme="minorHAnsi" w:eastAsiaTheme="minorEastAsia" w:hAnsiTheme="minorHAnsi"/>
-              <w:noProof/>
-              <w:lang w:val="en-ID" w:eastAsia="en-ID"/>
-            </w:rPr>
-          </w:pPr>
-          <w:hyperlink w:anchor="_Toc227856153" w:history="1">
-            <w:r>
-              <w:rPr>
-                <w:rStyle w:val="Hyperlink"/>
-                <w:rFonts w:cs="Times New Roman"/>
-                <w:bCs/>
-                <w:noProof/>
-                <w:lang w:val="id-ID"/>
-              </w:rPr>
-              <w:t xml:space="preserve">2.2 </w:t>
-            </w:r>
-            <w:r>
-              <w:rPr>
-                <w:rFonts w:asciiTheme="minorHAnsi" w:eastAsiaTheme="minorEastAsia" w:hAnsiTheme="minorHAnsi"/>
-                <w:noProof/>
-                <w:lang w:val="en-ID" w:eastAsia="en-ID"/>
-              </w:rPr>
-              <w:tab/>
-            </w:r>
-            <w:r>
-              <w:rPr>
-                <w:rStyle w:val="Hyperlink"/>
-                <w:rFonts w:cs="Times New Roman"/>
-                <w:bCs/>
-                <w:noProof/>
-              </w:rPr>
-              <w:t>Manajemen Proyek (GitHub)</w:t>
-            </w:r>
-            <w:r>
-              <w:rPr>
-                <w:noProof/>
-                <w:webHidden/>
-              </w:rPr>
-              <w:tab/>
-            </w:r>
-            <w:r>
-              <w:rPr>
-                <w:noProof/>
-                <w:webHidden/>
-              </w:rPr>
-              <w:fldChar w:fldCharType="begin"/>
-            </w:r>
-            <w:r>
-              <w:rPr>
-                <w:noProof/>
-                <w:webHidden/>
-              </w:rPr>
-              <w:instrText xml:space="preserve"> PAGEREF _Toc227856153 \h </w:instrText>
-            </w:r>
-            <w:r>
-              <w:rPr>
-                <w:noProof/>
-                <w:webHidden/>
-              </w:rPr>
-            </w:r>
-            <w:r>
-              <w:rPr>
-                <w:noProof/>
-                <w:webHidden/>
-              </w:rPr>
-              <w:fldChar w:fldCharType="separate"/>
-            </w:r>
-            <w:r>
-              <w:rPr>
-                <w:noProof/>
-                <w:webHidden/>
-              </w:rPr>
-              <w:t>4</w:t>
-            </w:r>
-            <w:r>
-              <w:rPr>
-                <w:noProof/>
-                <w:webHidden/>
-              </w:rPr>
-              <w:fldChar w:fldCharType="end"/>
-            </w:r>
-          </w:hyperlink>
-        </w:p>
-        <w:p>
-          <w:pPr>
-            <w:pStyle w:val="TOC1"/>
-            <w:tabs>
-              <w:tab w:val="right" w:leader="dot" w:pos="9350"/>
-            </w:tabs>
-            <w:rPr>
-              <w:rFonts w:asciiTheme="minorHAnsi" w:eastAsiaTheme="minorEastAsia" w:hAnsiTheme="minorHAnsi"/>
-              <w:noProof/>
-              <w:lang w:val="en-ID" w:eastAsia="en-ID"/>
-            </w:rPr>
-          </w:pPr>
-          <w:hyperlink w:anchor="_Toc227856154" w:history="1">
-            <w:r>
-              <w:rPr>
-                <w:rStyle w:val="Hyperlink"/>
-                <w:noProof/>
-              </w:rPr>
-              <w:t xml:space="preserve"> BAB 3  PEMODELAN SISTEM</w:t>
-            </w:r>
-            <w:r>
-              <w:rPr>
-                <w:noProof/>
-                <w:webHidden/>
-              </w:rPr>
-              <w:tab/>
-            </w:r>
-            <w:r>
-              <w:rPr>
-                <w:noProof/>
-                <w:webHidden/>
-              </w:rPr>
-              <w:fldChar w:fldCharType="begin"/>
-            </w:r>
-            <w:r>
-              <w:rPr>
-                <w:noProof/>
-                <w:webHidden/>
-              </w:rPr>
-              <w:instrText xml:space="preserve"> PAGEREF _Toc227856154 \h </w:instrText>
-            </w:r>
-            <w:r>
-              <w:rPr>
-                <w:noProof/>
-                <w:webHidden/>
-              </w:rPr>
-            </w:r>
-            <w:r>
-              <w:rPr>
-                <w:noProof/>
-                <w:webHidden/>
-              </w:rPr>
-              <w:fldChar w:fldCharType="separate"/>
-            </w:r>
-            <w:r>
-              <w:rPr>
-                <w:noProof/>
-                <w:webHidden/>
-              </w:rPr>
-              <w:t>5</w:t>
-            </w:r>
-            <w:r>
-              <w:rPr>
-                <w:noProof/>
-                <w:webHidden/>
-              </w:rPr>
-              <w:fldChar w:fldCharType="end"/>
-            </w:r>
-          </w:hyperlink>
-        </w:p>
-        <w:p>
-          <w:pPr>
-            <w:pStyle w:val="TOC2"/>
-            <w:tabs>
-              <w:tab w:val="right" w:leader="dot" w:pos="9350"/>
-            </w:tabs>
-            <w:rPr>
-              <w:rFonts w:asciiTheme="minorHAnsi" w:eastAsiaTheme="minorEastAsia" w:hAnsiTheme="minorHAnsi"/>
-              <w:noProof/>
-              <w:lang w:val="en-ID" w:eastAsia="en-ID"/>
-            </w:rPr>
-          </w:pPr>
-          <w:hyperlink w:anchor="_Toc227856155" w:history="1">
-            <w:r>
-              <w:rPr>
-                <w:rStyle w:val="Hyperlink"/>
-                <w:rFonts w:cs="Times New Roman"/>
-                <w:bCs/>
-                <w:noProof/>
-              </w:rPr>
-              <w:t>3.1 Use Case Diagram</w:t>
-            </w:r>
-            <w:r>
-              <w:rPr>
-                <w:noProof/>
-                <w:webHidden/>
-              </w:rPr>
-              <w:tab/>
-            </w:r>
-            <w:r>
-              <w:rPr>
-                <w:noProof/>
-                <w:webHidden/>
-              </w:rPr>
-              <w:fldChar w:fldCharType="begin"/>
-            </w:r>
-            <w:r>
-              <w:rPr>
-                <w:noProof/>
-                <w:webHidden/>
-              </w:rPr>
-              <w:instrText xml:space="preserve"> PAGEREF _Toc227856155 \h </w:instrText>
-            </w:r>
-            <w:r>
-              <w:rPr>
-                <w:noProof/>
-                <w:webHidden/>
-              </w:rPr>
-            </w:r>
-            <w:r>
-              <w:rPr>
-                <w:noProof/>
-                <w:webHidden/>
-              </w:rPr>
-              <w:fldChar w:fldCharType="separate"/>
-            </w:r>
-            <w:r>
-              <w:rPr>
-                <w:noProof/>
-                <w:webHidden/>
-              </w:rPr>
-              <w:t>6</w:t>
-            </w:r>
-            <w:r>
-              <w:rPr>
-                <w:noProof/>
-                <w:webHidden/>
-              </w:rPr>
-              <w:fldChar w:fldCharType="end"/>
-            </w:r>
-          </w:hyperlink>
-        </w:p>
-        <w:p>
-          <w:pPr>
-            <w:pStyle w:val="TOC2"/>
-            <w:tabs>
-              <w:tab w:val="right" w:leader="dot" w:pos="9350"/>
-            </w:tabs>
-            <w:rPr>
-              <w:rFonts w:asciiTheme="minorHAnsi" w:eastAsiaTheme="minorEastAsia" w:hAnsiTheme="minorHAnsi"/>
-              <w:noProof/>
-              <w:lang w:val="en-ID" w:eastAsia="en-ID"/>
-            </w:rPr>
-          </w:pPr>
-          <w:hyperlink w:anchor="_Toc227856156" w:history="1">
-            <w:r>
-              <w:rPr>
-                <w:rStyle w:val="Hyperlink"/>
-                <w:noProof/>
-              </w:rPr>
-              <w:t>3.2 Class Diagram</w:t>
-            </w:r>
-            <w:r>
-              <w:rPr>
-                <w:noProof/>
-                <w:webHidden/>
-              </w:rPr>
-              <w:tab/>
-            </w:r>
-            <w:r>
-              <w:rPr>
-                <w:noProof/>
-                <w:webHidden/>
-              </w:rPr>
-              <w:fldChar w:fldCharType="begin"/>
-            </w:r>
-            <w:r>
-              <w:rPr>
-                <w:noProof/>
-                <w:webHidden/>
-              </w:rPr>
-              <w:instrText xml:space="preserve"> PAGEREF _Toc227856156 \h </w:instrText>
-            </w:r>
-            <w:r>
-              <w:rPr>
-                <w:noProof/>
-                <w:webHidden/>
-              </w:rPr>
-            </w:r>
-            <w:r>
-              <w:rPr>
-                <w:noProof/>
-                <w:webHidden/>
-              </w:rPr>
-              <w:fldChar w:fldCharType="separate"/>
-            </w:r>
-            <w:r>
-              <w:rPr>
-                <w:noProof/>
-                <w:webHidden/>
-              </w:rPr>
-              <w:t>8</w:t>
-            </w:r>
-            <w:r>
-              <w:rPr>
-                <w:noProof/>
-                <w:webHidden/>
-              </w:rPr>
-              <w:fldChar w:fldCharType="end"/>
-            </w:r>
-          </w:hyperlink>
-        </w:p>
-        <w:p>
-          <w:pPr>
-            <w:pStyle w:val="TOC1"/>
-            <w:tabs>
-              <w:tab w:val="right" w:leader="dot" w:pos="9350"/>
-            </w:tabs>
-            <w:rPr>
-              <w:rFonts w:asciiTheme="minorHAnsi" w:eastAsiaTheme="minorEastAsia" w:hAnsiTheme="minorHAnsi"/>
-              <w:noProof/>
-              <w:lang w:val="en-ID" w:eastAsia="en-ID"/>
-            </w:rPr>
-          </w:pPr>
-          <w:hyperlink w:anchor="_Toc227856157" w:history="1">
-            <w:r>
-              <w:rPr>
-                <w:rStyle w:val="Hyperlink"/>
-                <w:noProof/>
-              </w:rPr>
-              <w:t>BAB 4  IMPLEMENTASI</w:t>
-            </w:r>
-            <w:r>
-              <w:rPr>
-                <w:noProof/>
-                <w:webHidden/>
-              </w:rPr>
-              <w:tab/>
-            </w:r>
-            <w:r>
-              <w:rPr>
-                <w:noProof/>
-                <w:webHidden/>
-              </w:rPr>
-              <w:fldChar w:fldCharType="begin"/>
-            </w:r>
-            <w:r>
-              <w:rPr>
-                <w:noProof/>
-                <w:webHidden/>
-              </w:rPr>
-              <w:instrText xml:space="preserve"> PAGEREF _Toc227856157 \h </w:instrText>
-            </w:r>
-            <w:r>
-              <w:rPr>
-                <w:noProof/>
-                <w:webHidden/>
-              </w:rPr>
-            </w:r>
-            <w:r>
-              <w:rPr>
-                <w:noProof/>
-                <w:webHidden/>
-              </w:rPr>
-              <w:fldChar w:fldCharType="separate"/>
-            </w:r>
-            <w:r>
-              <w:rPr>
-                <w:noProof/>
-                <w:webHidden/>
-              </w:rPr>
-              <w:t>10</w:t>
-            </w:r>
-            <w:r>
-              <w:rPr>
-                <w:noProof/>
-                <w:webHidden/>
-              </w:rPr>
-              <w:fldChar w:fldCharType="end"/>
-            </w:r>
-          </w:hyperlink>
-        </w:p>
-        <w:p>
-          <w:pPr>
-            <w:pStyle w:val="TOC2"/>
-            <w:tabs>
-              <w:tab w:val="right" w:leader="dot" w:pos="9350"/>
-            </w:tabs>
-            <w:rPr>
-              <w:rFonts w:asciiTheme="minorHAnsi" w:eastAsiaTheme="minorEastAsia" w:hAnsiTheme="minorHAnsi"/>
-              <w:noProof/>
-              <w:lang w:val="en-ID" w:eastAsia="en-ID"/>
-            </w:rPr>
-          </w:pPr>
-          <w:hyperlink w:anchor="_Toc227856158" w:history="1">
-            <w:r>
-              <w:rPr>
-                <w:rStyle w:val="Hyperlink"/>
-                <w:rFonts w:cs="Times New Roman"/>
-                <w:bCs/>
-                <w:noProof/>
-              </w:rPr>
-              <w:t>4.1 Source Code Kotlin</w:t>
-            </w:r>
-            <w:r>
-              <w:rPr>
-                <w:noProof/>
-                <w:webHidden/>
-              </w:rPr>
-              <w:tab/>
-            </w:r>
-            <w:r>
-              <w:rPr>
-                <w:noProof/>
-                <w:webHidden/>
-              </w:rPr>
-              <w:fldChar w:fldCharType="begin"/>
-            </w:r>
-            <w:r>
-              <w:rPr>
-                <w:noProof/>
-                <w:webHidden/>
-              </w:rPr>
-              <w:instrText xml:space="preserve"> PAGEREF _Toc227856158 \h </w:instrText>
-            </w:r>
-            <w:r>
-              <w:rPr>
-                <w:noProof/>
-                <w:webHidden/>
-              </w:rPr>
-            </w:r>
-            <w:r>
-              <w:rPr>
-                <w:noProof/>
-                <w:webHidden/>
-              </w:rPr>
-              <w:fldChar w:fldCharType="separate"/>
-            </w:r>
-            <w:r>
-              <w:rPr>
-                <w:noProof/>
-                <w:webHidden/>
-              </w:rPr>
-              <w:t>10</w:t>
-            </w:r>
-            <w:r>
-              <w:rPr>
-                <w:noProof/>
-                <w:webHidden/>
-              </w:rPr>
-              <w:fldChar w:fldCharType="end"/>
-            </w:r>
-          </w:hyperlink>
-        </w:p>
-        <w:p>
-          <w:pPr>
-            <w:pStyle w:val="TOC2"/>
-            <w:tabs>
-              <w:tab w:val="right" w:leader="dot" w:pos="9350"/>
-            </w:tabs>
-            <w:rPr>
-              <w:rFonts w:asciiTheme="minorHAnsi" w:eastAsiaTheme="minorEastAsia" w:hAnsiTheme="minorHAnsi"/>
-              <w:noProof/>
-              <w:lang w:val="en-ID" w:eastAsia="en-ID"/>
-            </w:rPr>
-          </w:pPr>
-          <w:hyperlink w:anchor="_Toc227856159" w:history="1">
-            <w:r>
-              <w:rPr>
-                <w:rStyle w:val="Hyperlink"/>
-                <w:rFonts w:cs="Times New Roman"/>
-                <w:bCs/>
-                <w:noProof/>
-              </w:rPr>
-              <w:t>4.2 Hasil Simulasi</w:t>
-            </w:r>
-            <w:r>
-              <w:rPr>
-                <w:noProof/>
-                <w:webHidden/>
-              </w:rPr>
-              <w:tab/>
-            </w:r>
-            <w:r>
-              <w:rPr>
-                <w:noProof/>
-                <w:webHidden/>
-              </w:rPr>
-              <w:fldChar w:fldCharType="begin"/>
-            </w:r>
-            <w:r>
-              <w:rPr>
-                <w:noProof/>
-                <w:webHidden/>
-              </w:rPr>
-              <w:instrText xml:space="preserve"> PAGEREF _Toc227856159 \h </w:instrText>
-            </w:r>
-            <w:r>
-              <w:rPr>
-                <w:noProof/>
-                <w:webHidden/>
-              </w:rPr>
-            </w:r>
-            <w:r>
-              <w:rPr>
-                <w:noProof/>
-                <w:webHidden/>
-              </w:rPr>
-              <w:fldChar w:fldCharType="separate"/>
-            </w:r>
-            <w:r>
-              <w:rPr>
-                <w:noProof/>
-                <w:webHidden/>
-              </w:rPr>
-              <w:t>14</w:t>
-            </w:r>
-            <w:r>
-              <w:rPr>
-                <w:noProof/>
-                <w:webHidden/>
-              </w:rPr>
-              <w:fldChar w:fldCharType="end"/>
-            </w:r>
-          </w:hyperlink>
-        </w:p>
-        <w:p>
-          <w:pPr>
-            <w:pStyle w:val="TOC1"/>
-            <w:tabs>
-              <w:tab w:val="right" w:leader="dot" w:pos="9350"/>
-            </w:tabs>
-            <w:rPr>
-              <w:rFonts w:asciiTheme="minorHAnsi" w:eastAsiaTheme="minorEastAsia" w:hAnsiTheme="minorHAnsi"/>
-              <w:noProof/>
-              <w:lang w:val="en-ID" w:eastAsia="en-ID"/>
-            </w:rPr>
-          </w:pPr>
-          <w:hyperlink w:anchor="_Toc227856160" w:history="1">
-            <w:r>
-              <w:rPr>
-                <w:rStyle w:val="Hyperlink"/>
-                <w:noProof/>
-              </w:rPr>
-              <w:t>BAB 5  PENUTUP</w:t>
-            </w:r>
-            <w:r>
-              <w:rPr>
-                <w:noProof/>
-                <w:webHidden/>
-              </w:rPr>
-              <w:tab/>
-            </w:r>
-            <w:r>
-              <w:rPr>
-                <w:noProof/>
-                <w:webHidden/>
-              </w:rPr>
-              <w:fldChar w:fldCharType="begin"/>
-            </w:r>
-            <w:r>
-              <w:rPr>
-                <w:noProof/>
-                <w:webHidden/>
-              </w:rPr>
-              <w:instrText xml:space="preserve"> PAGEREF _Toc227856160 \h </w:instrText>
-            </w:r>
-            <w:r>
-              <w:rPr>
-                <w:noProof/>
-                <w:webHidden/>
-              </w:rPr>
-            </w:r>
-            <w:r>
-              <w:rPr>
-                <w:noProof/>
-                <w:webHidden/>
-              </w:rPr>
-              <w:fldChar w:fldCharType="separate"/>
-            </w:r>
-            <w:r>
-              <w:rPr>
-                <w:noProof/>
-                <w:webHidden/>
-              </w:rPr>
-              <w:t>16</w:t>
-            </w:r>
-            <w:r>
-              <w:rPr>
-                <w:noProof/>
-                <w:webHidden/>
-              </w:rPr>
-              <w:fldChar w:fldCharType="end"/>
-            </w:r>
-          </w:hyperlink>
-        </w:p>
-        <w:p>
-          <w:pPr>
-            <w:pStyle w:val="TOC2"/>
-            <w:tabs>
-              <w:tab w:val="right" w:leader="dot" w:pos="9350"/>
-            </w:tabs>
-            <w:rPr>
-              <w:rFonts w:asciiTheme="minorHAnsi" w:eastAsiaTheme="minorEastAsia" w:hAnsiTheme="minorHAnsi"/>
-              <w:noProof/>
-              <w:lang w:val="en-ID" w:eastAsia="en-ID"/>
-            </w:rPr>
-          </w:pPr>
-          <w:hyperlink w:anchor="_Toc227856161" w:history="1">
-            <w:r>
-              <w:rPr>
-                <w:rStyle w:val="Hyperlink"/>
-                <w:rFonts w:cs="Times New Roman"/>
-                <w:bCs/>
-                <w:noProof/>
-              </w:rPr>
-              <w:t>5.1 Kesimpulan</w:t>
-            </w:r>
-            <w:r>
-              <w:rPr>
-                <w:noProof/>
-                <w:webHidden/>
-              </w:rPr>
-              <w:tab/>
-            </w:r>
-            <w:r>
-              <w:rPr>
-                <w:noProof/>
-                <w:webHidden/>
-              </w:rPr>
-              <w:fldChar w:fldCharType="begin"/>
-            </w:r>
-            <w:r>
-              <w:rPr>
-                <w:noProof/>
-                <w:webHidden/>
-              </w:rPr>
-              <w:instrText xml:space="preserve"> PAGEREF _Toc227856161 \h </w:instrText>
-            </w:r>
-            <w:r>
-              <w:rPr>
-                <w:noProof/>
-                <w:webHidden/>
-              </w:rPr>
-            </w:r>
-            <w:r>
-              <w:rPr>
-                <w:noProof/>
-                <w:webHidden/>
-              </w:rPr>
-              <w:fldChar w:fldCharType="separate"/>
-            </w:r>
-            <w:r>
-              <w:rPr>
-                <w:noProof/>
-                <w:webHidden/>
-              </w:rPr>
-              <w:t>16</w:t>
-            </w:r>
-            <w:r>
-              <w:rPr>
-                <w:noProof/>
-                <w:webHidden/>
-              </w:rPr>
-              <w:fldChar w:fldCharType="end"/>
-            </w:r>
-          </w:hyperlink>
-        </w:p>
-        <w:p>
-          <w:pPr>
-            <w:pStyle w:val="TOC2"/>
-            <w:tabs>
-              <w:tab w:val="right" w:leader="dot" w:pos="9350"/>
-            </w:tabs>
-            <w:rPr>
-              <w:rFonts w:asciiTheme="minorHAnsi" w:eastAsiaTheme="minorEastAsia" w:hAnsiTheme="minorHAnsi"/>
-              <w:noProof/>
-              <w:lang w:val="en-ID" w:eastAsia="en-ID"/>
-            </w:rPr>
-          </w:pPr>
-          <w:hyperlink w:anchor="_Toc227856162" w:history="1">
-            <w:r>
-              <w:rPr>
-                <w:rStyle w:val="Hyperlink"/>
-                <w:rFonts w:cs="Times New Roman"/>
-                <w:bCs/>
-                <w:noProof/>
-              </w:rPr>
-              <w:t>5.2 Saran</w:t>
-            </w:r>
-            <w:r>
-              <w:rPr>
-                <w:noProof/>
-                <w:webHidden/>
-              </w:rPr>
-              <w:tab/>
-            </w:r>
-            <w:r>
-              <w:rPr>
-                <w:noProof/>
-                <w:webHidden/>
-              </w:rPr>
-              <w:fldChar w:fldCharType="begin"/>
-            </w:r>
-            <w:r>
-              <w:rPr>
-                <w:noProof/>
-                <w:webHidden/>
-              </w:rPr>
-              <w:instrText xml:space="preserve"> PAGEREF _Toc227856162 \h </w:instrText>
-            </w:r>
-            <w:r>
-              <w:rPr>
-                <w:noProof/>
-                <w:webHidden/>
-              </w:rPr>
-            </w:r>
-            <w:r>
-              <w:rPr>
-                <w:noProof/>
-                <w:webHidden/>
-              </w:rPr>
-              <w:fldChar w:fldCharType="separate"/>
-            </w:r>
-            <w:r>
-              <w:rPr>
-                <w:noProof/>
-                <w:webHidden/>
-              </w:rPr>
-              <w:t>17</w:t>
-            </w:r>
-            <w:r>
-              <w:rPr>
-                <w:noProof/>
-                <w:webHidden/>
-              </w:rPr>
-              <w:fldChar w:fldCharType="end"/>
-            </w:r>
-          </w:hyperlink>
-        </w:p>
-        <w:p>
-          <w:pPr>
-            <w:pStyle w:val="TOC2"/>
-            <w:tabs>
-              <w:tab w:val="right" w:leader="dot" w:pos="9350"/>
-            </w:tabs>
-            <w:spacing w:line="360" w:lineRule="auto"/>
-            <w:sectPr>
-              <w:type w:val="continuous"/>
-              <w:pgSz w:w="12240" w:h="15840"/>
-              <w:pgMar w:top="1440" w:right="1440" w:bottom="1440" w:left="1440" w:header="708" w:footer="708" w:gutter="0"/>
-              <w:pgNumType w:fmt="lowerRoman" w:start="1"/>
-              <w:cols w:space="708"/>
-              <w:titlePg/>
-              <w:docGrid w:linePitch="360"/>
-            </w:sectPr>
-          </w:pPr>
-          <w:r>
-            <w:rPr>
-              <w:b/>
-              <w:bCs/>
-              <w:noProof/>
-            </w:rPr>
-            <w:fldChar w:fldCharType="end"/>
-          </w:r>
-        </w:p>
-      </w:sdtContent>
-    </w:sdt>
-    <w:p>
-      <w:pPr>
-        <w:pStyle w:val="Heading1"/>
-        <w:spacing w:before="0" w:line="360" w:lineRule="auto"/>
-        <w:rPr>
-          <w:rFonts w:cs="Times New Roman"/>
-          <w:bCs/>
-          <w:color w:val="auto"/>
-          <w:szCs w:val="24"/>
-          <w:lang w:val="id-ID"/>
-        </w:rPr>
-      </w:pPr>
-      <w:bookmarkStart w:id="1" w:name="_Toc227856147"/>
-      <w:r>
-        <w:rPr>
-          <w:rFonts w:cs="Times New Roman"/>
-          <w:bCs/>
-          <w:color w:val="auto"/>
-          <w:szCs w:val="24"/>
-          <w:lang w:val="id-ID"/>
-        </w:rPr>
-        <w:lastRenderedPageBreak/>
-        <w:t>DAFTAR GAMBAR</w:t>
-      </w:r>
-    </w:p>
-    <w:p>
-      <w:pPr>
-        <w:rPr>
-          <w:lang w:val="id-ID"/>
-        </w:rPr>
-      </w:pPr>
-    </w:p>
-    <w:p>
-      <w:pPr>
-        <w:pStyle w:val="TableofFigures"/>
-        <w:tabs>
-          <w:tab w:val="right" w:leader="dot" w:pos="8261"/>
-        </w:tabs>
-        <w:rPr>
-          <w:rFonts w:asciiTheme="minorHAnsi" w:eastAsiaTheme="minorEastAsia" w:hAnsiTheme="minorHAnsi"/>
-          <w:noProof/>
-          <w:lang w:val="en-ID" w:eastAsia="en-ID"/>
-        </w:rPr>
-      </w:pPr>
-      <w:r>
-        <w:rPr>
-          <w:lang w:val="id-ID"/>
-        </w:rPr>
-        <w:fldChar w:fldCharType="begin"/>
-      </w:r>
-      <w:r>
-        <w:rPr>
-          <w:lang w:val="id-ID"/>
-        </w:rPr>
-        <w:instrText xml:space="preserve"> TOC \h \z \c "Gambar 4." </w:instrText>
-      </w:r>
-      <w:r>
-        <w:rPr>
-          <w:lang w:val="id-ID"/>
-        </w:rPr>
-        <w:fldChar w:fldCharType="separate"/>
-      </w:r>
-    </w:p>
-    <w:p>
-      <w:pPr>
-        <w:rPr>
-          <w:lang w:val="id-ID"/>
-        </w:rPr>
-        <w:sectPr>
-          <w:pgSz w:w="12240" w:h="15840"/>
-          <w:pgMar w:top="1701" w:right="1701" w:bottom="1701" w:left="2268" w:header="708" w:footer="708" w:gutter="0"/>
-          <w:pgNumType w:start="1"/>
-          <w:cols w:space="708"/>
-          <w:docGrid w:linePitch="360"/>
-        </w:sectPr>
-      </w:pPr>
-      <w:r>
-        <w:rPr>
-          <w:lang w:val="id-ID"/>
-        </w:rPr>
-        <w:fldChar w:fldCharType="end"/>
+        <w:t>202</w:t>
       </w:r>
     </w:p>
     <w:p>
@@ -1980,6 +492,7 @@
           <w:lang w:val="id-ID"/>
         </w:rPr>
       </w:pPr>
+      <w:bookmarkStart w:id="0" w:name="_Toc227856147"/>
       <w:r>
         <w:rPr>
           <w:rFonts w:cs="Times New Roman"/>
@@ -2021,7 +534,7 @@
         </w:rPr>
         <w:t>PENDAHULUAN</w:t>
       </w:r>
-      <w:bookmarkEnd w:id="1"/>
+      <w:bookmarkEnd w:id="0"/>
     </w:p>
     <w:p>
       <w:pPr>
@@ -2049,7 +562,7 @@
         </w:rPr>
         <w:tab/>
       </w:r>
-      <w:bookmarkStart w:id="2" w:name="_Toc227856148"/>
+      <w:bookmarkStart w:id="1" w:name="_Toc227856148"/>
       <w:r>
         <w:rPr>
           <w:rFonts w:cs="Times New Roman"/>
@@ -2060,7 +573,7 @@
         </w:rPr>
         <w:t>Latar Belakang</w:t>
       </w:r>
-      <w:bookmarkEnd w:id="2"/>
+      <w:bookmarkEnd w:id="1"/>
     </w:p>
     <w:p>
       <w:pPr>
@@ -4656,7 +3169,7 @@
           <w:lang w:val="id-ID"/>
         </w:rPr>
       </w:pPr>
-      <w:bookmarkStart w:id="3" w:name="_Toc227856149"/>
+      <w:bookmarkStart w:id="2" w:name="_Toc227856149"/>
       <w:r>
         <w:rPr>
           <w:rFonts w:cs="Times New Roman"/>
@@ -4668,7 +3181,7 @@
         <w:lastRenderedPageBreak/>
         <w:t>Rumusan Masalah</w:t>
       </w:r>
-      <w:bookmarkEnd w:id="3"/>
+      <w:bookmarkEnd w:id="2"/>
     </w:p>
     <w:p>
       <w:pPr>
@@ -5496,7 +4009,7 @@
           <w:lang w:val="id-ID"/>
         </w:rPr>
       </w:pPr>
-      <w:bookmarkStart w:id="4" w:name="_Toc227856150"/>
+      <w:bookmarkStart w:id="3" w:name="_Toc227856150"/>
       <w:r>
         <w:rPr>
           <w:rFonts w:cs="Times New Roman"/>
@@ -5507,7 +4020,7 @@
         </w:rPr>
         <w:t>Tujuan</w:t>
       </w:r>
-      <w:bookmarkEnd w:id="4"/>
+      <w:bookmarkEnd w:id="3"/>
       <w:r>
         <w:rPr>
           <w:rFonts w:cs="Times New Roman"/>
@@ -6109,7 +4622,7 @@
         </w:rPr>
         <w:br w:type="column"/>
       </w:r>
-      <w:bookmarkStart w:id="5" w:name="_Toc227856151"/>
+      <w:bookmarkStart w:id="4" w:name="_Toc227856151"/>
       <w:r>
         <w:rPr>
           <w:lang w:val="id-ID"/>
@@ -6135,7 +4648,7 @@
         </w:rPr>
         <w:t>ANALISIS SISTEM</w:t>
       </w:r>
-      <w:bookmarkEnd w:id="5"/>
+      <w:bookmarkEnd w:id="4"/>
     </w:p>
     <w:p>
       <w:pPr>
@@ -6149,7 +4662,7 @@
           <w:lang w:val="id-ID"/>
         </w:rPr>
       </w:pPr>
-      <w:bookmarkStart w:id="6" w:name="_Toc227856152"/>
+      <w:bookmarkStart w:id="5" w:name="_Toc227856152"/>
       <w:r>
         <w:rPr>
           <w:rFonts w:cs="Times New Roman"/>
@@ -6180,7 +4693,7 @@
         </w:rPr>
         <w:t>Analisis OOP</w:t>
       </w:r>
-      <w:bookmarkEnd w:id="6"/>
+      <w:bookmarkEnd w:id="5"/>
     </w:p>
     <w:p>
       <w:pPr>
@@ -7981,7 +6494,7 @@
           <w:szCs w:val="24"/>
         </w:rPr>
       </w:pPr>
-      <w:bookmarkStart w:id="7" w:name="_Toc227856153"/>
+      <w:bookmarkStart w:id="6" w:name="_Toc227856153"/>
       <w:r>
         <w:rPr>
           <w:rFonts w:cs="Times New Roman"/>
@@ -8043,7 +6556,7 @@
         </w:rPr>
         <w:t xml:space="preserve"> (GitHub)</w:t>
       </w:r>
-      <w:bookmarkEnd w:id="7"/>
+      <w:bookmarkEnd w:id="6"/>
     </w:p>
     <w:p>
       <w:pPr>
@@ -10294,7 +8807,7 @@
         <w:pStyle w:val="Heading1"/>
         <w:spacing w:before="0" w:line="360" w:lineRule="auto"/>
       </w:pPr>
-      <w:bookmarkStart w:id="8" w:name="_Toc227856154"/>
+      <w:bookmarkStart w:id="7" w:name="_Toc227856154"/>
       <w:r>
         <w:rPr>
           <w:noProof/>
@@ -11184,7 +9697,18 @@
                                 <w:sz w:val="24"/>
                                 <w:szCs w:val="24"/>
                               </w:rPr>
-                              <w:t xml:space="preserve"> Gi</w:t>
+                              <w:t xml:space="preserve"> </w:t>
+                            </w:r>
+                            <w:proofErr w:type="spellStart"/>
+                            <w:r>
+                              <w:rPr>
+                                <w:i w:val="0"/>
+                                <w:iCs w:val="0"/>
+                                <w:color w:val="000000" w:themeColor="text1"/>
+                                <w:sz w:val="24"/>
+                                <w:szCs w:val="24"/>
+                              </w:rPr>
+                              <w:t>Gi</w:t>
                             </w:r>
                             <w:r>
                               <w:rPr>
@@ -11194,7 +9718,18 @@
                                 <w:sz w:val="24"/>
                                 <w:szCs w:val="24"/>
                               </w:rPr>
-                              <w:t>Gambar 3.</w:t>
+                              <w:t>Gambar</w:t>
+                            </w:r>
+                            <w:proofErr w:type="spellEnd"/>
+                            <w:r>
+                              <w:rPr>
+                                <w:i w:val="0"/>
+                                <w:iCs w:val="0"/>
+                                <w:color w:val="000000" w:themeColor="text1"/>
+                                <w:sz w:val="24"/>
+                                <w:szCs w:val="24"/>
+                              </w:rPr>
+                              <w:t xml:space="preserve"> 3.</w:t>
                             </w:r>
                             <w:r>
                               <w:rPr>
@@ -11265,7 +9800,7 @@
                                 <w:sz w:val="24"/>
                                 <w:szCs w:val="24"/>
                               </w:rPr>
-                              <w:t>Use Case Diagram</w:t>
+                              <w:t xml:space="preserve">Use Case </w:t>
                             </w:r>
                             <w:proofErr w:type="spellStart"/>
                             <w:r>
@@ -11276,7 +9811,27 @@
                                 <w:sz w:val="24"/>
                                 <w:szCs w:val="24"/>
                               </w:rPr>
+                              <w:t>Diagram</w:t>
+                            </w:r>
+                            <w:r>
+                              <w:rPr>
+                                <w:i w:val="0"/>
+                                <w:iCs w:val="0"/>
+                                <w:color w:val="000000" w:themeColor="text1"/>
+                                <w:sz w:val="24"/>
+                                <w:szCs w:val="24"/>
+                              </w:rPr>
                               <w:t>po</w:t>
+                            </w:r>
+                            <w:r>
+                              <w:rPr>
+                                <w:i w:val="0"/>
+                                <w:iCs w:val="0"/>
+                                <w:color w:val="000000" w:themeColor="text1"/>
+                                <w:sz w:val="24"/>
+                                <w:szCs w:val="24"/>
+                              </w:rPr>
+                              <w:t>Gambar</w:t>
                             </w:r>
                             <w:proofErr w:type="spellEnd"/>
                             <w:r>
@@ -11287,7 +9842,7 @@
                                 <w:sz w:val="24"/>
                                 <w:szCs w:val="24"/>
                               </w:rPr>
-                              <w:t>Gambar 3.</w:t>
+                              <w:t xml:space="preserve"> 3.</w:t>
                             </w:r>
                             <w:r>
                               <w:rPr>
@@ -11348,9 +9903,19 @@
                                 <w:sz w:val="24"/>
                                 <w:szCs w:val="24"/>
                               </w:rPr>
-                              <w:t xml:space="preserve"> Class Diagram</w:t>
+                              <w:t xml:space="preserve"> Class </w:t>
                             </w:r>
                             <w:proofErr w:type="spellStart"/>
+                            <w:r>
+                              <w:rPr>
+                                <w:i w:val="0"/>
+                                <w:iCs w:val="0"/>
+                                <w:color w:val="000000" w:themeColor="text1"/>
+                                <w:sz w:val="24"/>
+                                <w:szCs w:val="24"/>
+                              </w:rPr>
+                              <w:t>Diagram</w:t>
+                            </w:r>
                             <w:r>
                               <w:rPr>
                                 <w:i w:val="0"/>
@@ -11479,9 +10044,9 @@
                                 <w:sz w:val="24"/>
                                 <w:szCs w:val="24"/>
                               </w:rPr>
-                              <w:t xml:space="preserve"> Gi</w:t>
+                              <w:t xml:space="preserve"> </w:t>
                             </w:r>
-                            <w:bookmarkStart w:id="9" w:name="_Toc227856257"/>
+                            <w:proofErr w:type="spellStart"/>
                             <w:r>
                               <w:rPr>
                                 <w:i w:val="0"/>
@@ -11490,7 +10055,29 @@
                                 <w:sz w:val="24"/>
                                 <w:szCs w:val="24"/>
                               </w:rPr>
-                              <w:t>Gambar 3.</w:t>
+                              <w:t>Gi</w:t>
+                            </w:r>
+                            <w:bookmarkStart w:id="8" w:name="_Toc227856257"/>
+                            <w:r>
+                              <w:rPr>
+                                <w:i w:val="0"/>
+                                <w:iCs w:val="0"/>
+                                <w:color w:val="000000" w:themeColor="text1"/>
+                                <w:sz w:val="24"/>
+                                <w:szCs w:val="24"/>
+                              </w:rPr>
+                              <w:t>Gambar</w:t>
+                            </w:r>
+                            <w:proofErr w:type="spellEnd"/>
+                            <w:r>
+                              <w:rPr>
+                                <w:i w:val="0"/>
+                                <w:iCs w:val="0"/>
+                                <w:color w:val="000000" w:themeColor="text1"/>
+                                <w:sz w:val="24"/>
+                                <w:szCs w:val="24"/>
+                              </w:rPr>
+                              <w:t xml:space="preserve"> 3.</w:t>
                             </w:r>
                             <w:r>
                               <w:rPr>
@@ -11561,10 +10148,20 @@
                                 <w:sz w:val="24"/>
                                 <w:szCs w:val="24"/>
                               </w:rPr>
-                              <w:t>Use Case Diagram</w:t>
+                              <w:t xml:space="preserve">Use Case </w:t>
                             </w:r>
-                            <w:bookmarkEnd w:id="9"/>
                             <w:proofErr w:type="spellStart"/>
+                            <w:r>
+                              <w:rPr>
+                                <w:i w:val="0"/>
+                                <w:iCs w:val="0"/>
+                                <w:color w:val="000000" w:themeColor="text1"/>
+                                <w:sz w:val="24"/>
+                                <w:szCs w:val="24"/>
+                              </w:rPr>
+                              <w:t>Diagram</w:t>
+                            </w:r>
+                            <w:bookmarkEnd w:id="8"/>
                             <w:r>
                               <w:rPr>
                                 <w:i w:val="0"/>
@@ -11575,7 +10172,17 @@
                               </w:rPr>
                               <w:t>po</w:t>
                             </w:r>
-                            <w:bookmarkStart w:id="10" w:name="_Toc227856258"/>
+                            <w:bookmarkStart w:id="9" w:name="_Toc227856258"/>
+                            <w:r>
+                              <w:rPr>
+                                <w:i w:val="0"/>
+                                <w:iCs w:val="0"/>
+                                <w:color w:val="000000" w:themeColor="text1"/>
+                                <w:sz w:val="24"/>
+                                <w:szCs w:val="24"/>
+                              </w:rPr>
+                              <w:t>Gambar</w:t>
+                            </w:r>
                             <w:proofErr w:type="spellEnd"/>
                             <w:r>
                               <w:rPr>
@@ -11585,7 +10192,7 @@
                                 <w:sz w:val="24"/>
                                 <w:szCs w:val="24"/>
                               </w:rPr>
-                              <w:t>Gambar 3.</w:t>
+                              <w:t xml:space="preserve"> 3.</w:t>
                             </w:r>
                             <w:r>
                               <w:rPr>
@@ -11646,10 +10253,20 @@
                                 <w:sz w:val="24"/>
                                 <w:szCs w:val="24"/>
                               </w:rPr>
-                              <w:t xml:space="preserve"> Class Diagram</w:t>
+                              <w:t xml:space="preserve"> Class </w:t>
                             </w:r>
-                            <w:bookmarkEnd w:id="10"/>
                             <w:proofErr w:type="spellStart"/>
+                            <w:r>
+                              <w:rPr>
+                                <w:i w:val="0"/>
+                                <w:iCs w:val="0"/>
+                                <w:color w:val="000000" w:themeColor="text1"/>
+                                <w:sz w:val="24"/>
+                                <w:szCs w:val="24"/>
+                              </w:rPr>
+                              <w:t>Diagram</w:t>
+                            </w:r>
+                            <w:bookmarkEnd w:id="9"/>
                             <w:r>
                               <w:rPr>
                                 <w:i w:val="0"/>
@@ -11669,9 +10286,9 @@
                                 <w:sz w:val="24"/>
                                 <w:szCs w:val="24"/>
                               </w:rPr>
-                              <w:t xml:space="preserve"> Git</w:t>
+                              <w:t xml:space="preserve"> </w:t>
                             </w:r>
-                            <w:bookmarkStart w:id="11" w:name="_Toc227856316"/>
+                            <w:proofErr w:type="spellStart"/>
                             <w:r>
                               <w:rPr>
                                 <w:i w:val="0"/>
@@ -11680,7 +10297,29 @@
                                 <w:sz w:val="24"/>
                                 <w:szCs w:val="24"/>
                               </w:rPr>
-                              <w:t>Gambar 4.</w:t>
+                              <w:t>Git</w:t>
+                            </w:r>
+                            <w:bookmarkStart w:id="10" w:name="_Toc227856316"/>
+                            <w:r>
+                              <w:rPr>
+                                <w:i w:val="0"/>
+                                <w:iCs w:val="0"/>
+                                <w:color w:val="000000" w:themeColor="text1"/>
+                                <w:sz w:val="24"/>
+                                <w:szCs w:val="24"/>
+                              </w:rPr>
+                              <w:t>Gambar</w:t>
+                            </w:r>
+                            <w:proofErr w:type="spellEnd"/>
+                            <w:r>
+                              <w:rPr>
+                                <w:i w:val="0"/>
+                                <w:iCs w:val="0"/>
+                                <w:color w:val="000000" w:themeColor="text1"/>
+                                <w:sz w:val="24"/>
+                                <w:szCs w:val="24"/>
+                              </w:rPr>
+                              <w:t xml:space="preserve"> 4.</w:t>
                             </w:r>
                             <w:r>
                               <w:rPr>
@@ -11763,9 +10402,20 @@
                                 <w:sz w:val="24"/>
                                 <w:szCs w:val="24"/>
                               </w:rPr>
-                              <w:t xml:space="preserve"> ITK Mart</w:t>
+                              <w:t xml:space="preserve"> ITK </w:t>
                             </w:r>
-                            <w:bookmarkEnd w:id="11"/>
+                            <w:proofErr w:type="spellStart"/>
+                            <w:r>
+                              <w:rPr>
+                                <w:i w:val="0"/>
+                                <w:iCs w:val="0"/>
+                                <w:color w:val="000000" w:themeColor="text1"/>
+                                <w:sz w:val="24"/>
+                                <w:szCs w:val="24"/>
+                              </w:rPr>
+                              <w:t>Mart</w:t>
+                            </w:r>
+                            <w:bookmarkEnd w:id="10"/>
                             <w:r>
                               <w:rPr>
                                 <w:i w:val="0"/>
@@ -11776,7 +10426,7 @@
                               </w:rPr>
                               <w:t>Hu</w:t>
                             </w:r>
-                            <w:bookmarkStart w:id="12" w:name="_Toc227856315"/>
+                            <w:bookmarkStart w:id="11" w:name="_Toc227856315"/>
                             <w:r>
                               <w:rPr>
                                 <w:i w:val="0"/>
@@ -11785,7 +10435,18 @@
                                 <w:sz w:val="24"/>
                                 <w:szCs w:val="24"/>
                               </w:rPr>
-                              <w:t>Gambar 4.</w:t>
+                              <w:t>Gambar</w:t>
+                            </w:r>
+                            <w:proofErr w:type="spellEnd"/>
+                            <w:r>
+                              <w:rPr>
+                                <w:i w:val="0"/>
+                                <w:iCs w:val="0"/>
+                                <w:color w:val="000000" w:themeColor="text1"/>
+                                <w:sz w:val="24"/>
+                                <w:szCs w:val="24"/>
+                              </w:rPr>
+                              <w:t xml:space="preserve"> 4.</w:t>
                             </w:r>
                             <w:r>
                               <w:rPr>
@@ -11868,9 +10529,9 @@
                                 <w:sz w:val="24"/>
                                 <w:szCs w:val="24"/>
                               </w:rPr>
-                              <w:t xml:space="preserve"> ITK Mart</w:t>
+                              <w:t xml:space="preserve"> ITK </w:t>
                             </w:r>
-                            <w:bookmarkEnd w:id="12"/>
+                            <w:proofErr w:type="spellStart"/>
                             <w:r>
                               <w:rPr>
                                 <w:i w:val="0"/>
@@ -11879,7 +10540,29 @@
                                 <w:sz w:val="24"/>
                                 <w:szCs w:val="24"/>
                               </w:rPr>
-                              <w:t>b Publik</w:t>
+                              <w:t>Mart</w:t>
+                            </w:r>
+                            <w:bookmarkEnd w:id="11"/>
+                            <w:r>
+                              <w:rPr>
+                                <w:i w:val="0"/>
+                                <w:iCs w:val="0"/>
+                                <w:color w:val="000000" w:themeColor="text1"/>
+                                <w:sz w:val="24"/>
+                                <w:szCs w:val="24"/>
+                              </w:rPr>
+                              <w:t>b</w:t>
+                            </w:r>
+                            <w:proofErr w:type="spellEnd"/>
+                            <w:r>
+                              <w:rPr>
+                                <w:i w:val="0"/>
+                                <w:iCs w:val="0"/>
+                                <w:color w:val="000000" w:themeColor="text1"/>
+                                <w:sz w:val="24"/>
+                                <w:szCs w:val="24"/>
+                              </w:rPr>
+                              <w:t xml:space="preserve"> Publik</w:t>
                             </w:r>
                           </w:p>
                         </w:txbxContent>
@@ -12012,7 +10695,18 @@
                           <w:sz w:val="24"/>
                           <w:szCs w:val="24"/>
                         </w:rPr>
-                        <w:t xml:space="preserve"> Gi</w:t>
+                        <w:t xml:space="preserve"> </w:t>
+                      </w:r>
+                      <w:proofErr w:type="spellStart"/>
+                      <w:r>
+                        <w:rPr>
+                          <w:i w:val="0"/>
+                          <w:iCs w:val="0"/>
+                          <w:color w:val="000000" w:themeColor="text1"/>
+                          <w:sz w:val="24"/>
+                          <w:szCs w:val="24"/>
+                        </w:rPr>
+                        <w:t>Gi</w:t>
                       </w:r>
                       <w:r>
                         <w:rPr>
@@ -12022,7 +10716,18 @@
                           <w:sz w:val="24"/>
                           <w:szCs w:val="24"/>
                         </w:rPr>
-                        <w:t>Gambar 3.</w:t>
+                        <w:t>Gambar</w:t>
+                      </w:r>
+                      <w:proofErr w:type="spellEnd"/>
+                      <w:r>
+                        <w:rPr>
+                          <w:i w:val="0"/>
+                          <w:iCs w:val="0"/>
+                          <w:color w:val="000000" w:themeColor="text1"/>
+                          <w:sz w:val="24"/>
+                          <w:szCs w:val="24"/>
+                        </w:rPr>
+                        <w:t xml:space="preserve"> 3.</w:t>
                       </w:r>
                       <w:r>
                         <w:rPr>
@@ -12093,7 +10798,7 @@
                           <w:sz w:val="24"/>
                           <w:szCs w:val="24"/>
                         </w:rPr>
-                        <w:t>Use Case Diagram</w:t>
+                        <w:t xml:space="preserve">Use Case </w:t>
                       </w:r>
                       <w:proofErr w:type="spellStart"/>
                       <w:r>
@@ -12104,7 +10809,27 @@
                           <w:sz w:val="24"/>
                           <w:szCs w:val="24"/>
                         </w:rPr>
+                        <w:t>Diagram</w:t>
+                      </w:r>
+                      <w:r>
+                        <w:rPr>
+                          <w:i w:val="0"/>
+                          <w:iCs w:val="0"/>
+                          <w:color w:val="000000" w:themeColor="text1"/>
+                          <w:sz w:val="24"/>
+                          <w:szCs w:val="24"/>
+                        </w:rPr>
                         <w:t>po</w:t>
+                      </w:r>
+                      <w:r>
+                        <w:rPr>
+                          <w:i w:val="0"/>
+                          <w:iCs w:val="0"/>
+                          <w:color w:val="000000" w:themeColor="text1"/>
+                          <w:sz w:val="24"/>
+                          <w:szCs w:val="24"/>
+                        </w:rPr>
+                        <w:t>Gambar</w:t>
                       </w:r>
                       <w:proofErr w:type="spellEnd"/>
                       <w:r>
@@ -12115,7 +10840,7 @@
                           <w:sz w:val="24"/>
                           <w:szCs w:val="24"/>
                         </w:rPr>
-                        <w:t>Gambar 3.</w:t>
+                        <w:t xml:space="preserve"> 3.</w:t>
                       </w:r>
                       <w:r>
                         <w:rPr>
@@ -12176,9 +10901,19 @@
                           <w:sz w:val="24"/>
                           <w:szCs w:val="24"/>
                         </w:rPr>
-                        <w:t xml:space="preserve"> Class Diagram</w:t>
+                        <w:t xml:space="preserve"> Class </w:t>
                       </w:r>
                       <w:proofErr w:type="spellStart"/>
+                      <w:r>
+                        <w:rPr>
+                          <w:i w:val="0"/>
+                          <w:iCs w:val="0"/>
+                          <w:color w:val="000000" w:themeColor="text1"/>
+                          <w:sz w:val="24"/>
+                          <w:szCs w:val="24"/>
+                        </w:rPr>
+                        <w:t>Diagram</w:t>
+                      </w:r>
                       <w:r>
                         <w:rPr>
                           <w:i w:val="0"/>
@@ -12307,9 +11042,9 @@
                           <w:sz w:val="24"/>
                           <w:szCs w:val="24"/>
                         </w:rPr>
-                        <w:t xml:space="preserve"> Gi</w:t>
+                        <w:t xml:space="preserve"> </w:t>
                       </w:r>
-                      <w:bookmarkStart w:id="13" w:name="_Toc227856257"/>
+                      <w:proofErr w:type="spellStart"/>
                       <w:r>
                         <w:rPr>
                           <w:i w:val="0"/>
@@ -12318,7 +11053,29 @@
                           <w:sz w:val="24"/>
                           <w:szCs w:val="24"/>
                         </w:rPr>
-                        <w:t>Gambar 3.</w:t>
+                        <w:t>Gi</w:t>
+                      </w:r>
+                      <w:bookmarkStart w:id="12" w:name="_Toc227856257"/>
+                      <w:r>
+                        <w:rPr>
+                          <w:i w:val="0"/>
+                          <w:iCs w:val="0"/>
+                          <w:color w:val="000000" w:themeColor="text1"/>
+                          <w:sz w:val="24"/>
+                          <w:szCs w:val="24"/>
+                        </w:rPr>
+                        <w:t>Gambar</w:t>
+                      </w:r>
+                      <w:proofErr w:type="spellEnd"/>
+                      <w:r>
+                        <w:rPr>
+                          <w:i w:val="0"/>
+                          <w:iCs w:val="0"/>
+                          <w:color w:val="000000" w:themeColor="text1"/>
+                          <w:sz w:val="24"/>
+                          <w:szCs w:val="24"/>
+                        </w:rPr>
+                        <w:t xml:space="preserve"> 3.</w:t>
                       </w:r>
                       <w:r>
                         <w:rPr>
@@ -12389,10 +11146,20 @@
                           <w:sz w:val="24"/>
                           <w:szCs w:val="24"/>
                         </w:rPr>
-                        <w:t>Use Case Diagram</w:t>
+                        <w:t xml:space="preserve">Use Case </w:t>
                       </w:r>
-                      <w:bookmarkEnd w:id="13"/>
                       <w:proofErr w:type="spellStart"/>
+                      <w:r>
+                        <w:rPr>
+                          <w:i w:val="0"/>
+                          <w:iCs w:val="0"/>
+                          <w:color w:val="000000" w:themeColor="text1"/>
+                          <w:sz w:val="24"/>
+                          <w:szCs w:val="24"/>
+                        </w:rPr>
+                        <w:t>Diagram</w:t>
+                      </w:r>
+                      <w:bookmarkEnd w:id="12"/>
                       <w:r>
                         <w:rPr>
                           <w:i w:val="0"/>
@@ -12403,7 +11170,17 @@
                         </w:rPr>
                         <w:t>po</w:t>
                       </w:r>
-                      <w:bookmarkStart w:id="14" w:name="_Toc227856258"/>
+                      <w:bookmarkStart w:id="13" w:name="_Toc227856258"/>
+                      <w:r>
+                        <w:rPr>
+                          <w:i w:val="0"/>
+                          <w:iCs w:val="0"/>
+                          <w:color w:val="000000" w:themeColor="text1"/>
+                          <w:sz w:val="24"/>
+                          <w:szCs w:val="24"/>
+                        </w:rPr>
+                        <w:t>Gambar</w:t>
+                      </w:r>
                       <w:proofErr w:type="spellEnd"/>
                       <w:r>
                         <w:rPr>
@@ -12413,7 +11190,7 @@
                           <w:sz w:val="24"/>
                           <w:szCs w:val="24"/>
                         </w:rPr>
-                        <w:t>Gambar 3.</w:t>
+                        <w:t xml:space="preserve"> 3.</w:t>
                       </w:r>
                       <w:r>
                         <w:rPr>
@@ -12474,10 +11251,20 @@
                           <w:sz w:val="24"/>
                           <w:szCs w:val="24"/>
                         </w:rPr>
-                        <w:t xml:space="preserve"> Class Diagram</w:t>
+                        <w:t xml:space="preserve"> Class </w:t>
                       </w:r>
-                      <w:bookmarkEnd w:id="14"/>
                       <w:proofErr w:type="spellStart"/>
+                      <w:r>
+                        <w:rPr>
+                          <w:i w:val="0"/>
+                          <w:iCs w:val="0"/>
+                          <w:color w:val="000000" w:themeColor="text1"/>
+                          <w:sz w:val="24"/>
+                          <w:szCs w:val="24"/>
+                        </w:rPr>
+                        <w:t>Diagram</w:t>
+                      </w:r>
+                      <w:bookmarkEnd w:id="13"/>
                       <w:r>
                         <w:rPr>
                           <w:i w:val="0"/>
@@ -12497,9 +11284,9 @@
                           <w:sz w:val="24"/>
                           <w:szCs w:val="24"/>
                         </w:rPr>
-                        <w:t xml:space="preserve"> Git</w:t>
+                        <w:t xml:space="preserve"> </w:t>
                       </w:r>
-                      <w:bookmarkStart w:id="15" w:name="_Toc227856316"/>
+                      <w:proofErr w:type="spellStart"/>
                       <w:r>
                         <w:rPr>
                           <w:i w:val="0"/>
@@ -12508,7 +11295,29 @@
                           <w:sz w:val="24"/>
                           <w:szCs w:val="24"/>
                         </w:rPr>
-                        <w:t>Gambar 4.</w:t>
+                        <w:t>Git</w:t>
+                      </w:r>
+                      <w:bookmarkStart w:id="14" w:name="_Toc227856316"/>
+                      <w:r>
+                        <w:rPr>
+                          <w:i w:val="0"/>
+                          <w:iCs w:val="0"/>
+                          <w:color w:val="000000" w:themeColor="text1"/>
+                          <w:sz w:val="24"/>
+                          <w:szCs w:val="24"/>
+                        </w:rPr>
+                        <w:t>Gambar</w:t>
+                      </w:r>
+                      <w:proofErr w:type="spellEnd"/>
+                      <w:r>
+                        <w:rPr>
+                          <w:i w:val="0"/>
+                          <w:iCs w:val="0"/>
+                          <w:color w:val="000000" w:themeColor="text1"/>
+                          <w:sz w:val="24"/>
+                          <w:szCs w:val="24"/>
+                        </w:rPr>
+                        <w:t xml:space="preserve"> 4.</w:t>
                       </w:r>
                       <w:r>
                         <w:rPr>
@@ -12591,9 +11400,20 @@
                           <w:sz w:val="24"/>
                           <w:szCs w:val="24"/>
                         </w:rPr>
-                        <w:t xml:space="preserve"> ITK Mart</w:t>
+                        <w:t xml:space="preserve"> ITK </w:t>
                       </w:r>
-                      <w:bookmarkEnd w:id="15"/>
+                      <w:proofErr w:type="spellStart"/>
+                      <w:r>
+                        <w:rPr>
+                          <w:i w:val="0"/>
+                          <w:iCs w:val="0"/>
+                          <w:color w:val="000000" w:themeColor="text1"/>
+                          <w:sz w:val="24"/>
+                          <w:szCs w:val="24"/>
+                        </w:rPr>
+                        <w:t>Mart</w:t>
+                      </w:r>
+                      <w:bookmarkEnd w:id="14"/>
                       <w:r>
                         <w:rPr>
                           <w:i w:val="0"/>
@@ -12604,7 +11424,7 @@
                         </w:rPr>
                         <w:t>Hu</w:t>
                       </w:r>
-                      <w:bookmarkStart w:id="16" w:name="_Toc227856315"/>
+                      <w:bookmarkStart w:id="15" w:name="_Toc227856315"/>
                       <w:r>
                         <w:rPr>
                           <w:i w:val="0"/>
@@ -12613,7 +11433,18 @@
                           <w:sz w:val="24"/>
                           <w:szCs w:val="24"/>
                         </w:rPr>
-                        <w:t>Gambar 4.</w:t>
+                        <w:t>Gambar</w:t>
+                      </w:r>
+                      <w:proofErr w:type="spellEnd"/>
+                      <w:r>
+                        <w:rPr>
+                          <w:i w:val="0"/>
+                          <w:iCs w:val="0"/>
+                          <w:color w:val="000000" w:themeColor="text1"/>
+                          <w:sz w:val="24"/>
+                          <w:szCs w:val="24"/>
+                        </w:rPr>
+                        <w:t xml:space="preserve"> 4.</w:t>
                       </w:r>
                       <w:r>
                         <w:rPr>
@@ -12696,9 +11527,9 @@
                           <w:sz w:val="24"/>
                           <w:szCs w:val="24"/>
                         </w:rPr>
-                        <w:t xml:space="preserve"> ITK Mart</w:t>
+                        <w:t xml:space="preserve"> ITK </w:t>
                       </w:r>
-                      <w:bookmarkEnd w:id="16"/>
+                      <w:proofErr w:type="spellStart"/>
                       <w:r>
                         <w:rPr>
                           <w:i w:val="0"/>
@@ -12707,7 +11538,29 @@
                           <w:sz w:val="24"/>
                           <w:szCs w:val="24"/>
                         </w:rPr>
-                        <w:t>b Publik</w:t>
+                        <w:t>Mart</w:t>
+                      </w:r>
+                      <w:bookmarkEnd w:id="15"/>
+                      <w:r>
+                        <w:rPr>
+                          <w:i w:val="0"/>
+                          <w:iCs w:val="0"/>
+                          <w:color w:val="000000" w:themeColor="text1"/>
+                          <w:sz w:val="24"/>
+                          <w:szCs w:val="24"/>
+                        </w:rPr>
+                        <w:t>b</w:t>
+                      </w:r>
+                      <w:proofErr w:type="spellEnd"/>
+                      <w:r>
+                        <w:rPr>
+                          <w:i w:val="0"/>
+                          <w:iCs w:val="0"/>
+                          <w:color w:val="000000" w:themeColor="text1"/>
+                          <w:sz w:val="24"/>
+                          <w:szCs w:val="24"/>
+                        </w:rPr>
+                        <w:t xml:space="preserve"> Publik</w:t>
                       </w:r>
                     </w:p>
                   </w:txbxContent>
@@ -12813,93 +11666,6 @@
                       </wps:spPr>
                       <wps:txbx>
                         <w:txbxContent>
-                          <w:p>
-                            <w:pPr>
-                              <w:pStyle w:val="Caption"/>
-                              <w:jc w:val="center"/>
-                              <w:rPr>
-                                <w:b/>
-                                <w:i w:val="0"/>
-                                <w:iCs w:val="0"/>
-                                <w:noProof/>
-                                <w:color w:val="000000" w:themeColor="text1"/>
-                                <w:sz w:val="36"/>
-                                <w:szCs w:val="24"/>
-                              </w:rPr>
-                            </w:pPr>
-                            <w:r>
-                              <w:rPr>
-                                <w:i w:val="0"/>
-                                <w:iCs w:val="0"/>
-                                <w:color w:val="000000" w:themeColor="text1"/>
-                                <w:sz w:val="24"/>
-                                <w:szCs w:val="24"/>
-                              </w:rPr>
-                              <w:t>Gambar 2.</w:t>
-                            </w:r>
-                            <w:r>
-                              <w:rPr>
-                                <w:i w:val="0"/>
-                                <w:iCs w:val="0"/>
-                                <w:color w:val="000000" w:themeColor="text1"/>
-                                <w:sz w:val="24"/>
-                                <w:szCs w:val="24"/>
-                              </w:rPr>
-                              <w:fldChar w:fldCharType="begin"/>
-                            </w:r>
-                            <w:r>
-                              <w:rPr>
-                                <w:i w:val="0"/>
-                                <w:iCs w:val="0"/>
-                                <w:color w:val="000000" w:themeColor="text1"/>
-                                <w:sz w:val="24"/>
-                                <w:szCs w:val="24"/>
-                              </w:rPr>
-                              <w:instrText xml:space="preserve"> SEQ Gambar_2. \* ARABIC </w:instrText>
-                            </w:r>
-                            <w:r>
-                              <w:rPr>
-                                <w:i w:val="0"/>
-                                <w:iCs w:val="0"/>
-                                <w:color w:val="000000" w:themeColor="text1"/>
-                                <w:sz w:val="24"/>
-                                <w:szCs w:val="24"/>
-                              </w:rPr>
-                              <w:fldChar w:fldCharType="separate"/>
-                            </w:r>
-                            <w:r>
-                              <w:rPr>
-                                <w:i w:val="0"/>
-                                <w:iCs w:val="0"/>
-                                <w:noProof/>
-                                <w:color w:val="000000" w:themeColor="text1"/>
-                                <w:sz w:val="24"/>
-                                <w:szCs w:val="24"/>
-                              </w:rPr>
-                              <w:t>3</w:t>
-                            </w:r>
-                            <w:r>
-                              <w:rPr>
-                                <w:i w:val="0"/>
-                                <w:iCs w:val="0"/>
-                                <w:color w:val="000000" w:themeColor="text1"/>
-                                <w:sz w:val="24"/>
-                                <w:szCs w:val="24"/>
-                              </w:rPr>
-                              <w:fldChar w:fldCharType="end"/>
-                            </w:r>
-                            <w:r>
-                              <w:rPr>
-                                <w:i w:val="0"/>
-                                <w:iCs w:val="0"/>
-                                <w:color w:val="000000" w:themeColor="text1"/>
-                                <w:sz w:val="24"/>
-                                <w:szCs w:val="24"/>
-                              </w:rPr>
-                              <w:t xml:space="preserve"> Riwayat (log) commit</w:t>
-                            </w:r>
-                          </w:p>
-                          <w:p/>
                           <w:p>
                             <w:pPr>
                               <w:pStyle w:val="Caption"/>
@@ -13091,93 +11857,6 @@
                         <w:t xml:space="preserve"> Riwayat (log) commit</w:t>
                       </w:r>
                     </w:p>
-                    <w:p/>
-                    <w:p>
-                      <w:pPr>
-                        <w:pStyle w:val="Caption"/>
-                        <w:jc w:val="center"/>
-                        <w:rPr>
-                          <w:b/>
-                          <w:i w:val="0"/>
-                          <w:iCs w:val="0"/>
-                          <w:noProof/>
-                          <w:color w:val="000000" w:themeColor="text1"/>
-                          <w:sz w:val="36"/>
-                          <w:szCs w:val="24"/>
-                        </w:rPr>
-                      </w:pPr>
-                      <w:r>
-                        <w:rPr>
-                          <w:i w:val="0"/>
-                          <w:iCs w:val="0"/>
-                          <w:color w:val="000000" w:themeColor="text1"/>
-                          <w:sz w:val="24"/>
-                          <w:szCs w:val="24"/>
-                        </w:rPr>
-                        <w:t>Gambar 2.</w:t>
-                      </w:r>
-                      <w:r>
-                        <w:rPr>
-                          <w:i w:val="0"/>
-                          <w:iCs w:val="0"/>
-                          <w:color w:val="000000" w:themeColor="text1"/>
-                          <w:sz w:val="24"/>
-                          <w:szCs w:val="24"/>
-                        </w:rPr>
-                        <w:fldChar w:fldCharType="begin"/>
-                      </w:r>
-                      <w:r>
-                        <w:rPr>
-                          <w:i w:val="0"/>
-                          <w:iCs w:val="0"/>
-                          <w:color w:val="000000" w:themeColor="text1"/>
-                          <w:sz w:val="24"/>
-                          <w:szCs w:val="24"/>
-                        </w:rPr>
-                        <w:instrText xml:space="preserve"> SEQ Gambar_2. \* ARABIC </w:instrText>
-                      </w:r>
-                      <w:r>
-                        <w:rPr>
-                          <w:i w:val="0"/>
-                          <w:iCs w:val="0"/>
-                          <w:color w:val="000000" w:themeColor="text1"/>
-                          <w:sz w:val="24"/>
-                          <w:szCs w:val="24"/>
-                        </w:rPr>
-                        <w:fldChar w:fldCharType="separate"/>
-                      </w:r>
-                      <w:r>
-                        <w:rPr>
-                          <w:i w:val="0"/>
-                          <w:iCs w:val="0"/>
-                          <w:noProof/>
-                          <w:color w:val="000000" w:themeColor="text1"/>
-                          <w:sz w:val="24"/>
-                          <w:szCs w:val="24"/>
-                        </w:rPr>
-                        <w:t>3</w:t>
-                      </w:r>
-                      <w:r>
-                        <w:rPr>
-                          <w:i w:val="0"/>
-                          <w:iCs w:val="0"/>
-                          <w:color w:val="000000" w:themeColor="text1"/>
-                          <w:sz w:val="24"/>
-                          <w:szCs w:val="24"/>
-                        </w:rPr>
-                        <w:fldChar w:fldCharType="end"/>
-                      </w:r>
-                      <w:r>
-                        <w:rPr>
-                          <w:i w:val="0"/>
-                          <w:iCs w:val="0"/>
-                          <w:color w:val="000000" w:themeColor="text1"/>
-                          <w:sz w:val="24"/>
-                          <w:szCs w:val="24"/>
-                        </w:rPr>
-                        <w:t xml:space="preserve"> Riwayat (log) commit</w:t>
-                      </w:r>
-                    </w:p>
                   </w:txbxContent>
                 </v:textbox>
                 <w10:wrap type="topAndBottom"/>
@@ -13263,7 +11942,7 @@
       <w:r>
         <w:t>PEMODELAN SISTEM</w:t>
       </w:r>
-      <w:bookmarkEnd w:id="8"/>
+      <w:bookmarkEnd w:id="7"/>
     </w:p>
     <w:p>
       <w:pPr>
@@ -13276,7 +11955,7 @@
           <w:szCs w:val="24"/>
         </w:rPr>
       </w:pPr>
-      <w:bookmarkStart w:id="17" w:name="_Toc227856155"/>
+      <w:bookmarkStart w:id="16" w:name="_Toc227856155"/>
       <w:r>
         <w:rPr>
           <w:noProof/>
@@ -13731,6 +12410,9 @@
         </mc:AlternateContent>
       </w:r>
       <w:r>
+        <w:rPr>
+          <w:noProof/>
+        </w:rPr>
         <w:drawing>
           <wp:anchor distT="0" distB="0" distL="114300" distR="114300" simplePos="0" relativeHeight="251683840" behindDoc="0" locked="0" layoutInCell="1" allowOverlap="1" wp14:anchorId="4793051C" wp14:editId="2E10A2CB">
             <wp:simplePos x="0" y="0"/>
@@ -13799,7 +12481,7 @@
         </w:rPr>
         <w:t>3.1 Use Case Diagram</w:t>
       </w:r>
-      <w:bookmarkEnd w:id="17"/>
+      <w:bookmarkEnd w:id="16"/>
     </w:p>
     <w:p>
       <w:pPr>
@@ -16470,7 +15152,7 @@
       <w:pPr>
         <w:pStyle w:val="Heading2"/>
       </w:pPr>
-      <w:bookmarkStart w:id="18" w:name="_Toc227856156"/>
+      <w:bookmarkStart w:id="17" w:name="_Toc227856156"/>
       <w:r>
         <w:rPr>
           <w:noProof/>
@@ -16711,6 +15393,9 @@
         </mc:AlternateContent>
       </w:r>
       <w:r>
+        <w:rPr>
+          <w:noProof/>
+        </w:rPr>
         <w:drawing>
           <wp:anchor distT="0" distB="0" distL="114300" distR="114300" simplePos="0" relativeHeight="251687936" behindDoc="0" locked="0" layoutInCell="1" allowOverlap="1" wp14:anchorId="4D675CD2" wp14:editId="05C925AE">
             <wp:simplePos x="0" y="0"/>
@@ -16773,7 +15458,7 @@
       <w:r>
         <w:t>3.2 Class Diagram</w:t>
       </w:r>
-      <w:bookmarkEnd w:id="18"/>
+      <w:bookmarkEnd w:id="17"/>
     </w:p>
     <w:p>
       <w:pPr>
@@ -18882,7 +17567,7 @@
       <w:r>
         <w:br w:type="column"/>
       </w:r>
-      <w:bookmarkStart w:id="19" w:name="_Toc227856157"/>
+      <w:bookmarkStart w:id="18" w:name="_Toc227856157"/>
       <w:r>
         <w:lastRenderedPageBreak/>
         <w:t>BAB</w:t>
@@ -18900,7 +17585,7 @@
       <w:r>
         <w:t>IMPLEMENTASI</w:t>
       </w:r>
-      <w:bookmarkEnd w:id="19"/>
+      <w:bookmarkEnd w:id="18"/>
     </w:p>
     <w:p>
       <w:pPr>
@@ -18914,7 +17599,7 @@
           <w:szCs w:val="24"/>
         </w:rPr>
       </w:pPr>
-      <w:bookmarkStart w:id="20" w:name="_Toc227856158"/>
+      <w:bookmarkStart w:id="19" w:name="_Toc227856158"/>
       <w:r>
         <w:rPr>
           <w:rFonts w:cs="Times New Roman"/>
@@ -18924,7 +17609,7 @@
         </w:rPr>
         <w:t>4.1 Source Code Kotlin</w:t>
       </w:r>
-      <w:bookmarkEnd w:id="20"/>
+      <w:bookmarkEnd w:id="19"/>
     </w:p>
     <w:p>
       <w:pPr>
@@ -26488,7 +25173,7 @@
           <w:szCs w:val="24"/>
         </w:rPr>
       </w:pPr>
-      <w:bookmarkStart w:id="21" w:name="_Toc227856159"/>
+      <w:bookmarkStart w:id="20" w:name="_Toc227856159"/>
       <w:r>
         <w:rPr>
           <w:noProof/>
@@ -26545,7 +25230,7 @@
                                 <w:szCs w:val="24"/>
                               </w:rPr>
                             </w:pPr>
-                            <w:bookmarkStart w:id="22" w:name="_Toc227856228"/>
+                            <w:bookmarkStart w:id="21" w:name="_Toc227856228"/>
                             <w:r>
                               <w:rPr>
                                 <w:i w:val="0"/>
@@ -26639,7 +25324,7 @@
                               </w:rPr>
                               <w:t xml:space="preserve"> ITK Mart</w:t>
                             </w:r>
-                            <w:bookmarkEnd w:id="22"/>
+                            <w:bookmarkEnd w:id="21"/>
                           </w:p>
                         </w:txbxContent>
                       </wps:txbx>
@@ -26674,7 +25359,7 @@
                           <w:szCs w:val="24"/>
                         </w:rPr>
                       </w:pPr>
-                      <w:bookmarkStart w:id="23" w:name="_Toc227856228"/>
+                      <w:bookmarkStart w:id="22" w:name="_Toc227856228"/>
                       <w:r>
                         <w:rPr>
                           <w:i w:val="0"/>
@@ -26768,7 +25453,7 @@
                         </w:rPr>
                         <w:t xml:space="preserve"> ITK Mart</w:t>
                       </w:r>
-                      <w:bookmarkEnd w:id="23"/>
+                      <w:bookmarkEnd w:id="22"/>
                     </w:p>
                   </w:txbxContent>
                 </v:textbox>
@@ -26779,6 +25464,9 @@
         </mc:AlternateContent>
       </w:r>
       <w:r>
+        <w:rPr>
+          <w:noProof/>
+        </w:rPr>
         <w:drawing>
           <wp:anchor distT="0" distB="0" distL="114300" distR="114300" simplePos="0" relativeHeight="251681792" behindDoc="0" locked="0" layoutInCell="1" allowOverlap="1" wp14:anchorId="00657181" wp14:editId="3446F8B0">
             <wp:simplePos x="0" y="0"/>
@@ -26877,7 +25565,7 @@
                                 <w:szCs w:val="24"/>
                               </w:rPr>
                             </w:pPr>
-                            <w:bookmarkStart w:id="24" w:name="_Toc227856229"/>
+                            <w:bookmarkStart w:id="23" w:name="_Toc227856229"/>
                             <w:r>
                               <w:rPr>
                                 <w:i w:val="0"/>
@@ -26971,7 +25659,7 @@
                               </w:rPr>
                               <w:t xml:space="preserve"> ITK Mart</w:t>
                             </w:r>
-                            <w:bookmarkEnd w:id="24"/>
+                            <w:bookmarkEnd w:id="23"/>
                           </w:p>
                         </w:txbxContent>
                       </wps:txbx>
@@ -27011,7 +25699,7 @@
                           <w:szCs w:val="24"/>
                         </w:rPr>
                       </w:pPr>
-                      <w:bookmarkStart w:id="25" w:name="_Toc227856229"/>
+                      <w:bookmarkStart w:id="24" w:name="_Toc227856229"/>
                       <w:r>
                         <w:rPr>
                           <w:i w:val="0"/>
@@ -27105,7 +25793,7 @@
                         </w:rPr>
                         <w:t xml:space="preserve"> ITK Mart</w:t>
                       </w:r>
-                      <w:bookmarkEnd w:id="25"/>
+                      <w:bookmarkEnd w:id="24"/>
                     </w:p>
                   </w:txbxContent>
                 </v:textbox>
@@ -27116,6 +25804,9 @@
         </mc:AlternateContent>
       </w:r>
       <w:r>
+        <w:rPr>
+          <w:noProof/>
+        </w:rPr>
         <w:drawing>
           <wp:anchor distT="0" distB="0" distL="114300" distR="114300" simplePos="0" relativeHeight="251679744" behindDoc="0" locked="0" layoutInCell="1" allowOverlap="1" wp14:anchorId="40314EBF" wp14:editId="4431D59E">
             <wp:simplePos x="0" y="0"/>
@@ -27179,7 +25870,7 @@
         </w:rPr>
         <w:t>Simulasi</w:t>
       </w:r>
-      <w:bookmarkEnd w:id="21"/>
+      <w:bookmarkEnd w:id="20"/>
       <w:proofErr w:type="spellEnd"/>
     </w:p>
     <w:p>
@@ -29458,7 +28149,7 @@
       <w:r>
         <w:br w:type="column"/>
       </w:r>
-      <w:bookmarkStart w:id="26" w:name="_Toc227856160"/>
+      <w:bookmarkStart w:id="25" w:name="_Toc227856160"/>
       <w:r>
         <w:lastRenderedPageBreak/>
         <w:t>BAB</w:t>
@@ -29478,7 +28169,7 @@
       <w:r>
         <w:t>PENUTUP</w:t>
       </w:r>
-      <w:bookmarkEnd w:id="26"/>
+      <w:bookmarkEnd w:id="25"/>
     </w:p>
     <w:p>
       <w:pPr>
@@ -29491,7 +28182,7 @@
           <w:szCs w:val="24"/>
         </w:rPr>
       </w:pPr>
-      <w:bookmarkStart w:id="27" w:name="_Toc227856161"/>
+      <w:bookmarkStart w:id="26" w:name="_Toc227856161"/>
       <w:r>
         <w:rPr>
           <w:rFonts w:cs="Times New Roman"/>
@@ -29501,7 +28192,7 @@
         </w:rPr>
         <w:t>5.1 Kesimpulan</w:t>
       </w:r>
-      <w:bookmarkEnd w:id="27"/>
+      <w:bookmarkEnd w:id="26"/>
       <w:r>
         <w:rPr>
           <w:rFonts w:cs="Times New Roman"/>
@@ -30945,7 +29636,7 @@
           <w:szCs w:val="24"/>
         </w:rPr>
       </w:pPr>
-      <w:bookmarkStart w:id="28" w:name="_Toc227856162"/>
+      <w:bookmarkStart w:id="27" w:name="_Toc227856162"/>
       <w:r>
         <w:rPr>
           <w:rFonts w:cs="Times New Roman"/>
@@ -30956,7 +29647,7 @@
         <w:lastRenderedPageBreak/>
         <w:t>5.2 Saran</w:t>
       </w:r>
-      <w:bookmarkEnd w:id="28"/>
+      <w:bookmarkEnd w:id="27"/>
     </w:p>
     <w:p>
       <w:pPr>
@@ -31893,49 +30584,12 @@
 
 <file path=word/footer1.xml><?xml version="1.0" encoding="utf-8"?>
 <w:ftr xmlns:wpc="http://schemas.microsoft.com/office/word/2010/wordprocessingCanvas" xmlns:cx="http://schemas.microsoft.com/office/drawing/2014/chartex" xmlns:cx1="http://schemas.microsoft.com/office/drawing/2015/9/8/chartex" xmlns:cx2="http://schemas.microsoft.com/office/drawing/2015/10/21/chartex" xmlns:cx3="http://schemas.microsoft.com/office/drawing/2016/5/9/chartex" xmlns:cx4="http://schemas.microsoft.com/office/drawing/2016/5/10/chartex" xmlns:cx5="http://schemas.microsoft.com/office/drawing/2016/5/11/chartex" xmlns:cx6="http://schemas.microsoft.com/office/drawing/2016/5/12/chartex" xmlns:cx7="http://schemas.microsoft.com/office/drawing/2016/5/13/chartex" xmlns:cx8="http://schemas.microsoft.com/office/drawing/2016/5/14/chartex" xmlns:mc="http://schemas.openxmlformats.org/markup-compatibility/2006" xmlns:aink="http://schemas.microsoft.com/office/drawing/2016/ink" xmlns:am3d="http://schemas.microsoft.com/office/drawing/2017/model3d" xmlns:o="urn:schemas-microsoft-com:office:office" xmlns:oel="http://schemas.microsoft.com/office/2019/extlst" xmlns:r="http://schemas.openxmlformats.org/officeDocument/2006/relationships" xmlns:m="http://schemas.openxmlformats.org/officeDocument/2006/math" xmlns:v="urn:schemas-microsoft-com:vml" xmlns:wp14="http://schemas.microsoft.com/office/word/2010/wordprocessingDrawing" xmlns:wp="http://schemas.openxmlformats.org/drawingml/2006/wordprocessingDrawing" xmlns:w10="urn:schemas-microsoft-com:office:word" xmlns:w="http://schemas.openxmlformats.org/wordprocessingml/2006/main" xmlns:w14="http://schemas.microsoft.com/office/word/2010/wordml" xmlns:w15="http://schemas.microsoft.com/office/word/2012/wordml" xmlns:w16cex="http://schemas.microsoft.com/office/word/2018/wordml/cex" xmlns:w16cid="http://schemas.microsoft.com/office/word/2016/wordml/cid" xmlns:w16="http://schemas.microsoft.com/office/word/2018/wordml" xmlns:w16du="http://schemas.microsoft.com/office/word/2023/wordml/word16du" xmlns:w16sdtdh="http://schemas.microsoft.com/office/word/2020/wordml/sdtdatahash" xmlns:w16sdtfl="http://schemas.microsoft.com/office/word/2024/wordml/sdtformatlock" xmlns:w16se="http://schemas.microsoft.com/office/word/2015/wordml/symex" xmlns:wpg="http://schemas.microsoft.com/office/word/2010/wordprocessingGroup" xmlns:wpi="http://schemas.microsoft.com/office/word/2010/wordprocessingInk" xmlns:wne="http://schemas.microsoft.com/office/word/2006/wordml" xmlns:wps="http://schemas.microsoft.com/office/word/2010/wordprocessingShape" mc:Ignorable="w14 w15 w16se w16cid w16 w16cex w16sdtdh w16sdtfl w16du wp14">
-  <w:sdt>
-    <w:sdtPr>
-      <w:id w:val="210315028"/>
-      <w:docPartObj>
-        <w:docPartGallery w:val="Page Numbers (Bottom of Page)"/>
-        <w:docPartUnique/>
-      </w:docPartObj>
-    </w:sdtPr>
-    <w:sdtEndPr>
-      <w:rPr>
-        <w:noProof/>
-      </w:rPr>
-    </w:sdtEndPr>
-    <w:sdtContent>
-      <w:p>
-        <w:pPr>
-          <w:pStyle w:val="Footer"/>
-          <w:jc w:val="center"/>
-        </w:pPr>
-        <w:r>
-          <w:fldChar w:fldCharType="begin"/>
-        </w:r>
-        <w:r>
-          <w:instrText xml:space="preserve"> PAGE   \* MERGEFORMAT </w:instrText>
-        </w:r>
-        <w:r>
-          <w:fldChar w:fldCharType="separate"/>
-        </w:r>
-        <w:r>
-          <w:rPr>
-            <w:noProof/>
-          </w:rPr>
-          <w:t>2</w:t>
-        </w:r>
-        <w:r>
-          <w:rPr>
-            <w:noProof/>
-          </w:rPr>
-          <w:fldChar w:fldCharType="end"/>
-        </w:r>
-      </w:p>
-    </w:sdtContent>
-  </w:sdt>
+  <w:p>
+    <w:pPr>
+      <w:pStyle w:val="Footer"/>
+      <w:jc w:val="center"/>
+    </w:pPr>
+  </w:p>
   <w:p>
     <w:pPr>
       <w:pStyle w:val="Footer"/>
@@ -31951,43 +30605,6 @@
       <w:pStyle w:val="Footer"/>
       <w:jc w:val="center"/>
     </w:pPr>
-    <w:sdt>
-      <w:sdtPr>
-        <w:id w:val="186269831"/>
-        <w:docPartObj>
-          <w:docPartGallery w:val="Page Numbers (Bottom of Page)"/>
-          <w:docPartUnique/>
-        </w:docPartObj>
-      </w:sdtPr>
-      <w:sdtEndPr>
-        <w:rPr>
-          <w:noProof/>
-        </w:rPr>
-      </w:sdtEndPr>
-      <w:sdtContent>
-        <w:r>
-          <w:fldChar w:fldCharType="begin"/>
-        </w:r>
-        <w:r>
-          <w:instrText xml:space="preserve"> PAGE   \* MERGEFORMAT </w:instrText>
-        </w:r>
-        <w:r>
-          <w:fldChar w:fldCharType="separate"/>
-        </w:r>
-        <w:r>
-          <w:rPr>
-            <w:noProof/>
-          </w:rPr>
-          <w:t>2</w:t>
-        </w:r>
-        <w:r>
-          <w:rPr>
-            <w:noProof/>
-          </w:rPr>
-          <w:fldChar w:fldCharType="end"/>
-        </w:r>
-      </w:sdtContent>
-    </w:sdt>
   </w:p>
   <w:p>
     <w:pPr>
@@ -33818,6 +32435,7 @@
   <w:style w:type="character" w:default="1" w:styleId="DefaultParagraphFont">
     <w:name w:val="Default Paragraph Font"/>
     <w:uiPriority w:val="1"/>
+    <w:semiHidden/>
     <w:unhideWhenUsed/>
   </w:style>
   <w:style w:type="table" w:default="1" w:styleId="TableNormal">

</xml_diff>